<commit_message>
Continue with the workflow
</commit_message>
<xml_diff>
--- a/workflow.docx
+++ b/workflow.docx
@@ -10,22 +10,21 @@
           <w:lang w:val="en-GB"/>
         </w:rPr>
       </w:pPr>
-      <w:proofErr w:type="spellStart"/>
       <w:r>
         <w:rPr>
           <w:rFonts w:ascii="Arial" w:hAnsi="Arial" w:cs="Arial"/>
           <w:lang w:val="en-GB"/>
         </w:rPr>
-        <w:t>stargzr</w:t>
-      </w:r>
-      <w:proofErr w:type="spellEnd"/>
-      <w:r>
+        <w:t>stargzr Workflow</w:t>
+      </w:r>
+    </w:p>
+    <w:p>
+      <w:pPr>
         <w:rPr>
           <w:rFonts w:ascii="Arial" w:hAnsi="Arial" w:cs="Arial"/>
           <w:lang w:val="en-GB"/>
         </w:rPr>
-        <w:t xml:space="preserve"> Workflow</w:t>
-      </w:r>
+      </w:pPr>
     </w:p>
     <w:p>
       <w:pPr>
@@ -39,29 +38,30 @@
       <w:pPr>
         <w:rPr>
           <w:rFonts w:ascii="Arial" w:hAnsi="Arial" w:cs="Arial"/>
+          <w:sz w:val="28"/>
+          <w:szCs w:val="28"/>
           <w:lang w:val="en-GB"/>
         </w:rPr>
       </w:pPr>
-    </w:p>
-    <w:p>
-      <w:pPr>
+      <w:r>
         <w:rPr>
           <w:rFonts w:ascii="Arial" w:hAnsi="Arial" w:cs="Arial"/>
           <w:sz w:val="28"/>
           <w:szCs w:val="28"/>
           <w:lang w:val="en-GB"/>
         </w:rPr>
-      </w:pPr>
-      <w:r>
+        <w:t xml:space="preserve">so… you ran stargzr huh </w:t>
+      </w:r>
+    </w:p>
+    <w:p>
+      <w:pPr>
         <w:rPr>
           <w:rFonts w:ascii="Arial" w:hAnsi="Arial" w:cs="Arial"/>
           <w:sz w:val="28"/>
           <w:szCs w:val="28"/>
           <w:lang w:val="en-GB"/>
         </w:rPr>
-        <w:t xml:space="preserve">so… you ran </w:t>
-      </w:r>
-      <w:proofErr w:type="spellStart"/>
+      </w:pPr>
       <w:r>
         <w:rPr>
           <w:rFonts w:ascii="Arial" w:hAnsi="Arial" w:cs="Arial"/>
@@ -69,9 +69,8 @@
           <w:szCs w:val="28"/>
           <w:lang w:val="en-GB"/>
         </w:rPr>
-        <w:t>stargzr</w:t>
-      </w:r>
-      <w:proofErr w:type="spellEnd"/>
+        <w:t>well, this is what happens</w:t>
+      </w:r>
       <w:r>
         <w:rPr>
           <w:rFonts w:ascii="Arial" w:hAnsi="Arial" w:cs="Arial"/>
@@ -79,7 +78,7 @@
           <w:szCs w:val="28"/>
           <w:lang w:val="en-GB"/>
         </w:rPr>
-        <w:t xml:space="preserve"> huh </w:t>
+        <w:t>. Also this assumes you have the code at hand so I don’t need to just copy the comment explanation on struct fields.</w:t>
       </w:r>
     </w:p>
     <w:p>
@@ -91,15 +90,16 @@
           <w:lang w:val="en-GB"/>
         </w:rPr>
       </w:pPr>
-      <w:r>
+    </w:p>
+    <w:p>
+      <w:pPr>
         <w:rPr>
           <w:rFonts w:ascii="Arial" w:hAnsi="Arial" w:cs="Arial"/>
           <w:sz w:val="28"/>
           <w:szCs w:val="28"/>
           <w:lang w:val="en-GB"/>
         </w:rPr>
-        <w:t>well, this is what happens</w:t>
-      </w:r>
+      </w:pPr>
       <w:r>
         <w:rPr>
           <w:rFonts w:ascii="Arial" w:hAnsi="Arial" w:cs="Arial"/>
@@ -107,9 +107,8 @@
           <w:szCs w:val="28"/>
           <w:lang w:val="en-GB"/>
         </w:rPr>
-        <w:t xml:space="preserve">. </w:t>
-      </w:r>
-      <w:proofErr w:type="gramStart"/>
+        <w:t>let</w:t>
+      </w:r>
       <w:r>
         <w:rPr>
           <w:rFonts w:ascii="Arial" w:hAnsi="Arial" w:cs="Arial"/>
@@ -117,9 +116,8 @@
           <w:szCs w:val="28"/>
           <w:lang w:val="en-GB"/>
         </w:rPr>
-        <w:t>Also</w:t>
-      </w:r>
-      <w:proofErr w:type="gramEnd"/>
+        <w:t>’</w:t>
+      </w:r>
       <w:r>
         <w:rPr>
           <w:rFonts w:ascii="Arial" w:hAnsi="Arial" w:cs="Arial"/>
@@ -127,19 +125,18 @@
           <w:szCs w:val="28"/>
           <w:lang w:val="en-GB"/>
         </w:rPr>
-        <w:t xml:space="preserve"> this assumes you have the code at </w:t>
-      </w:r>
-      <w:proofErr w:type="gramStart"/>
-      <w:r>
+        <w:t xml:space="preserve">s start from main.rs </w:t>
+      </w:r>
+    </w:p>
+    <w:p>
+      <w:pPr>
         <w:rPr>
           <w:rFonts w:ascii="Arial" w:hAnsi="Arial" w:cs="Arial"/>
           <w:sz w:val="28"/>
           <w:szCs w:val="28"/>
           <w:lang w:val="en-GB"/>
         </w:rPr>
-        <w:t>hand</w:t>
-      </w:r>
-      <w:proofErr w:type="gramEnd"/>
+      </w:pPr>
       <w:r>
         <w:rPr>
           <w:rFonts w:ascii="Arial" w:hAnsi="Arial" w:cs="Arial"/>
@@ -147,7 +144,7 @@
           <w:szCs w:val="28"/>
           <w:lang w:val="en-GB"/>
         </w:rPr>
-        <w:t xml:space="preserve"> so I don’t need to just copy the comment explanation on struct fields.</w:t>
+        <w:t>here we first look at the env variables that are only set if this is ran through docker – otherwise for the path we assume that the folder is called media and that it is in the root of the project.</w:t>
       </w:r>
     </w:p>
     <w:p>
@@ -159,16 +156,15 @@
           <w:lang w:val="en-GB"/>
         </w:rPr>
       </w:pPr>
-    </w:p>
-    <w:p>
-      <w:pPr>
+      <w:r>
         <w:rPr>
           <w:rFonts w:ascii="Arial" w:hAnsi="Arial" w:cs="Arial"/>
           <w:sz w:val="28"/>
           <w:szCs w:val="28"/>
           <w:lang w:val="en-GB"/>
         </w:rPr>
-      </w:pPr>
+        <w:t>and now we initialize by sending the bath as a PathBuf, which is just rust’s way of knowing that this is a file</w:t>
+      </w:r>
       <w:r>
         <w:rPr>
           <w:rFonts w:ascii="Arial" w:hAnsi="Arial" w:cs="Arial"/>
@@ -176,7 +172,7 @@
           <w:szCs w:val="28"/>
           <w:lang w:val="en-GB"/>
         </w:rPr>
-        <w:t>let</w:t>
+        <w:t xml:space="preserve"> </w:t>
       </w:r>
       <w:r>
         <w:rPr>
@@ -185,7 +181,7 @@
           <w:szCs w:val="28"/>
           <w:lang w:val="en-GB"/>
         </w:rPr>
-        <w:t>’</w:t>
+        <w:t>path so it know</w:t>
       </w:r>
       <w:r>
         <w:rPr>
@@ -194,132 +190,16 @@
           <w:szCs w:val="28"/>
           <w:lang w:val="en-GB"/>
         </w:rPr>
-        <w:t xml:space="preserve">s start from main.rs </w:t>
-      </w:r>
-    </w:p>
-    <w:p>
-      <w:pPr>
+        <w:t>s</w:t>
+      </w:r>
+      <w:r>
         <w:rPr>
           <w:rFonts w:ascii="Arial" w:hAnsi="Arial" w:cs="Arial"/>
           <w:sz w:val="28"/>
           <w:szCs w:val="28"/>
           <w:lang w:val="en-GB"/>
         </w:rPr>
-      </w:pPr>
-      <w:r>
-        <w:rPr>
-          <w:rFonts w:ascii="Arial" w:hAnsi="Arial" w:cs="Arial"/>
-          <w:sz w:val="28"/>
-          <w:szCs w:val="28"/>
-          <w:lang w:val="en-GB"/>
-        </w:rPr>
-        <w:t>here we first look at the env variables that are only set if this is ran through docker – otherwise for the path we assume that the folder is called media and that it is in the root of the project.</w:t>
-      </w:r>
-    </w:p>
-    <w:p>
-      <w:pPr>
-        <w:rPr>
-          <w:rFonts w:ascii="Arial" w:hAnsi="Arial" w:cs="Arial"/>
-          <w:sz w:val="28"/>
-          <w:szCs w:val="28"/>
-          <w:lang w:val="en-GB"/>
-        </w:rPr>
-      </w:pPr>
-      <w:r>
-        <w:rPr>
-          <w:rFonts w:ascii="Arial" w:hAnsi="Arial" w:cs="Arial"/>
-          <w:sz w:val="28"/>
-          <w:szCs w:val="28"/>
-          <w:lang w:val="en-GB"/>
-        </w:rPr>
-        <w:t xml:space="preserve">and now we initialize by sending the bath as a </w:t>
-      </w:r>
-      <w:proofErr w:type="spellStart"/>
-      <w:r>
-        <w:rPr>
-          <w:rFonts w:ascii="Arial" w:hAnsi="Arial" w:cs="Arial"/>
-          <w:sz w:val="28"/>
-          <w:szCs w:val="28"/>
-          <w:lang w:val="en-GB"/>
-        </w:rPr>
-        <w:t>PathBuf</w:t>
-      </w:r>
-      <w:proofErr w:type="spellEnd"/>
-      <w:r>
-        <w:rPr>
-          <w:rFonts w:ascii="Arial" w:hAnsi="Arial" w:cs="Arial"/>
-          <w:sz w:val="28"/>
-          <w:szCs w:val="28"/>
-          <w:lang w:val="en-GB"/>
-        </w:rPr>
-        <w:t>, which is just rust’s way of knowing that this is a file</w:t>
-      </w:r>
-      <w:r>
-        <w:rPr>
-          <w:rFonts w:ascii="Arial" w:hAnsi="Arial" w:cs="Arial"/>
-          <w:sz w:val="28"/>
-          <w:szCs w:val="28"/>
-          <w:lang w:val="en-GB"/>
-        </w:rPr>
-        <w:t xml:space="preserve"> </w:t>
-      </w:r>
-      <w:proofErr w:type="gramStart"/>
-      <w:r>
-        <w:rPr>
-          <w:rFonts w:ascii="Arial" w:hAnsi="Arial" w:cs="Arial"/>
-          <w:sz w:val="28"/>
-          <w:szCs w:val="28"/>
-          <w:lang w:val="en-GB"/>
-        </w:rPr>
-        <w:t>path</w:t>
-      </w:r>
-      <w:proofErr w:type="gramEnd"/>
-      <w:r>
-        <w:rPr>
-          <w:rFonts w:ascii="Arial" w:hAnsi="Arial" w:cs="Arial"/>
-          <w:sz w:val="28"/>
-          <w:szCs w:val="28"/>
-          <w:lang w:val="en-GB"/>
-        </w:rPr>
-        <w:t xml:space="preserve"> so it know</w:t>
-      </w:r>
-      <w:r>
-        <w:rPr>
-          <w:rFonts w:ascii="Arial" w:hAnsi="Arial" w:cs="Arial"/>
-          <w:sz w:val="28"/>
-          <w:szCs w:val="28"/>
-          <w:lang w:val="en-GB"/>
-        </w:rPr>
-        <w:t>s</w:t>
-      </w:r>
-      <w:r>
-        <w:rPr>
-          <w:rFonts w:ascii="Arial" w:hAnsi="Arial" w:cs="Arial"/>
-          <w:sz w:val="28"/>
-          <w:szCs w:val="28"/>
-          <w:lang w:val="en-GB"/>
-        </w:rPr>
-        <w:t xml:space="preserve"> how to add stuff to it like extensions (.mp3, .mp4…) or other files like media/</w:t>
-      </w:r>
-      <w:proofErr w:type="spellStart"/>
-      <w:r>
-        <w:rPr>
-          <w:rFonts w:ascii="Arial" w:hAnsi="Arial" w:cs="Arial"/>
-          <w:sz w:val="28"/>
-          <w:szCs w:val="28"/>
-          <w:lang w:val="en-GB"/>
-        </w:rPr>
-        <w:t>some_folder</w:t>
-      </w:r>
-      <w:proofErr w:type="spellEnd"/>
-      <w:r>
-        <w:rPr>
-          <w:rFonts w:ascii="Arial" w:hAnsi="Arial" w:cs="Arial"/>
-          <w:sz w:val="28"/>
-          <w:szCs w:val="28"/>
-          <w:lang w:val="en-GB"/>
-        </w:rPr>
-        <w:t>/this.txt.</w:t>
+        <w:t xml:space="preserve"> how to add stuff to it like extensions (.mp3, .mp4…) or other files like media/some_folder/this.txt.</w:t>
       </w:r>
     </w:p>
     <w:p>
@@ -1983,6 +1863,2472 @@
         </w:rPr>
         <w:t xml:space="preserve"> </w:t>
       </w:r>
+      <w:r>
+        <w:rPr>
+          <w:rFonts w:ascii="Arial" w:hAnsi="Arial" w:cs="Arial"/>
+          <w:sz w:val="28"/>
+          <w:szCs w:val="28"/>
+        </w:rPr>
+        <w:t>say someone wants to access this servers API they would do that by going to the / or /player route (let’s assume that every call is nested with the /strgzr prefix from here and on). T</w:t>
+      </w:r>
+      <w:r>
+        <w:rPr>
+          <w:rFonts w:ascii="Arial" w:hAnsi="Arial" w:cs="Arial"/>
+          <w:sz w:val="28"/>
+          <w:szCs w:val="28"/>
+        </w:rPr>
+        <w:t xml:space="preserve">he browser opens (or reuses) a TCP connection and sends a GET /stargzr/ request. Hyper reads the bytes from the socket, parses the HTTP request, and hands it to Axum’s router. </w:t>
+      </w:r>
+      <w:r>
+        <w:rPr>
+          <w:rFonts w:ascii="Arial" w:hAnsi="Arial" w:cs="Arial"/>
+          <w:sz w:val="28"/>
+          <w:szCs w:val="28"/>
+        </w:rPr>
+        <w:t>T</w:t>
+      </w:r>
+      <w:r>
+        <w:rPr>
+          <w:rFonts w:ascii="Arial" w:hAnsi="Arial" w:cs="Arial"/>
+          <w:sz w:val="28"/>
+          <w:szCs w:val="28"/>
+        </w:rPr>
+        <w:t>he router matches the / route inside the nested player router and executes player_page</w:t>
+      </w:r>
+      <w:r>
+        <w:rPr>
+          <w:rFonts w:ascii="Arial" w:hAnsi="Arial" w:cs="Arial"/>
+          <w:sz w:val="28"/>
+          <w:szCs w:val="28"/>
+        </w:rPr>
+        <w:t xml:space="preserve"> function</w:t>
+      </w:r>
+    </w:p>
+    <w:p>
+      <w:pPr>
+        <w:ind w:left="705"/>
+        <w:rPr>
+          <w:rFonts w:ascii="Arial" w:hAnsi="Arial" w:cs="Arial"/>
+          <w:sz w:val="28"/>
+          <w:szCs w:val="28"/>
+        </w:rPr>
+      </w:pPr>
+      <w:r>
+        <w:rPr>
+          <w:rFonts w:ascii="Arial" w:hAnsi="Arial" w:cs="Arial"/>
+          <w:sz w:val="28"/>
+          <w:szCs w:val="28"/>
+        </w:rPr>
+        <w:t xml:space="preserve">the function lives in handlers.rs. </w:t>
+      </w:r>
+      <w:r>
+        <w:rPr>
+          <w:rFonts w:ascii="Arial" w:hAnsi="Arial" w:cs="Arial"/>
+          <w:sz w:val="28"/>
+          <w:szCs w:val="28"/>
+        </w:rPr>
+        <w:t>Axum's extractor system kicks in before the function body runs. State(state) tells Axum to pull the SharedState out of the request extensions</w:t>
+      </w:r>
+      <w:r>
+        <w:rPr>
+          <w:rFonts w:ascii="Arial" w:hAnsi="Arial" w:cs="Arial"/>
+          <w:sz w:val="28"/>
+          <w:szCs w:val="28"/>
+        </w:rPr>
+        <w:t xml:space="preserve">, </w:t>
+      </w:r>
+      <w:r>
+        <w:rPr>
+          <w:rFonts w:ascii="Arial" w:hAnsi="Arial" w:cs="Arial"/>
+          <w:sz w:val="28"/>
+          <w:szCs w:val="28"/>
+        </w:rPr>
+        <w:t>remember that with_state() attached it to the router earlier, so every handler can grab it this way. HeaderMap is another extractor that gives us the raw HTTP headers from the request. Both are resolved by Axum before the function body executes.</w:t>
+      </w:r>
+    </w:p>
+    <w:p>
+      <w:pPr>
+        <w:ind w:left="1410"/>
+        <w:rPr>
+          <w:rFonts w:ascii="Arial" w:hAnsi="Arial" w:cs="Arial"/>
+          <w:sz w:val="28"/>
+          <w:szCs w:val="28"/>
+        </w:rPr>
+      </w:pPr>
+      <w:r>
+        <w:rPr>
+          <w:rFonts w:ascii="Arial" w:hAnsi="Arial" w:cs="Arial"/>
+          <w:sz w:val="28"/>
+          <w:szCs w:val="28"/>
+        </w:rPr>
+        <w:t xml:space="preserve">get_session_id </w:t>
+      </w:r>
+      <w:r>
+        <w:rPr>
+          <w:rFonts w:ascii="Arial" w:hAnsi="Arial" w:cs="Arial"/>
+          <w:sz w:val="28"/>
+          <w:szCs w:val="28"/>
+        </w:rPr>
+        <w:t xml:space="preserve">in sessions.rs </w:t>
+      </w:r>
+      <w:r>
+        <w:rPr>
+          <w:rFonts w:ascii="Arial" w:hAnsi="Arial" w:cs="Arial"/>
+          <w:sz w:val="28"/>
+          <w:szCs w:val="28"/>
+        </w:rPr>
+        <w:t>looks for a session cookie in the Cookie header. If one exists and is valid it returns that ID; if not it generates a fresh UUID. This is how stargzr knows who is who without any login system.</w:t>
+      </w:r>
+    </w:p>
+    <w:p>
+      <w:pPr>
+        <w:rPr>
+          <w:rFonts w:ascii="Arial" w:hAnsi="Arial" w:cs="Arial"/>
+          <w:sz w:val="28"/>
+          <w:szCs w:val="28"/>
+        </w:rPr>
+      </w:pPr>
+      <w:r>
+        <w:rPr>
+          <w:rFonts w:ascii="Arial" w:hAnsi="Arial" w:cs="Arial"/>
+          <w:sz w:val="28"/>
+          <w:szCs w:val="28"/>
+        </w:rPr>
+        <w:tab/>
+      </w:r>
+    </w:p>
+    <w:p>
+      <w:pPr>
+        <w:ind w:left="1410"/>
+        <w:rPr>
+          <w:rFonts w:ascii="Arial" w:hAnsi="Arial" w:cs="Arial"/>
+          <w:sz w:val="28"/>
+          <w:szCs w:val="28"/>
+        </w:rPr>
+      </w:pPr>
+      <w:r>
+        <w:rPr>
+          <w:rFonts w:ascii="Arial" w:hAnsi="Arial" w:cs="Arial"/>
+          <w:sz w:val="28"/>
+          <w:szCs w:val="28"/>
+        </w:rPr>
+        <w:lastRenderedPageBreak/>
+        <w:t>e</w:t>
+      </w:r>
+      <w:r>
+        <w:rPr>
+          <w:rFonts w:ascii="Arial" w:hAnsi="Arial" w:cs="Arial"/>
+          <w:sz w:val="28"/>
+          <w:szCs w:val="28"/>
+        </w:rPr>
+        <w:t>ach session has its own cursor into the playlist</w:t>
+      </w:r>
+      <w:r>
+        <w:rPr>
+          <w:rFonts w:ascii="Arial" w:hAnsi="Arial" w:cs="Arial"/>
+          <w:sz w:val="28"/>
+          <w:szCs w:val="28"/>
+        </w:rPr>
+        <w:t>,</w:t>
+      </w:r>
+      <w:r>
+        <w:rPr>
+          <w:rFonts w:ascii="Arial" w:hAnsi="Arial" w:cs="Arial"/>
+          <w:sz w:val="28"/>
+          <w:szCs w:val="28"/>
+        </w:rPr>
+        <w:t xml:space="preserve"> the track they were last on. get_or_create_position looks up the session in the shared state's session map. If the session is new, it inserts a fresh entry at index 0. Either way it returns a usiz</w:t>
+      </w:r>
+      <w:r>
+        <w:rPr>
+          <w:rFonts w:ascii="Arial" w:hAnsi="Arial" w:cs="Arial"/>
+          <w:sz w:val="28"/>
+          <w:szCs w:val="28"/>
+        </w:rPr>
+        <w:t>e</w:t>
+      </w:r>
+      <w:r>
+        <w:rPr>
+          <w:rFonts w:ascii="Arial" w:hAnsi="Arial" w:cs="Arial"/>
+          <w:sz w:val="28"/>
+          <w:szCs w:val="28"/>
+        </w:rPr>
+        <w:t>.</w:t>
+      </w:r>
+    </w:p>
+    <w:p>
+      <w:pPr>
+        <w:ind w:left="705"/>
+        <w:rPr>
+          <w:rFonts w:ascii="Arial" w:hAnsi="Arial" w:cs="Arial"/>
+          <w:sz w:val="28"/>
+          <w:szCs w:val="28"/>
+        </w:rPr>
+      </w:pPr>
+      <w:r>
+        <w:rPr>
+          <w:rFonts w:ascii="Arial" w:hAnsi="Arial" w:cs="Arial"/>
+          <w:sz w:val="28"/>
+          <w:szCs w:val="28"/>
+        </w:rPr>
+        <w:t xml:space="preserve">next we need the name of the actual thing the user is playing. </w:t>
+      </w:r>
+      <w:r>
+        <w:rPr>
+          <w:rFonts w:ascii="Arial" w:hAnsi="Arial" w:cs="Arial"/>
+          <w:sz w:val="28"/>
+          <w:szCs w:val="28"/>
+        </w:rPr>
+        <w:t>The playlist lives behind a RwLock</w:t>
+      </w:r>
+      <w:r>
+        <w:rPr>
+          <w:rFonts w:ascii="Arial" w:hAnsi="Arial" w:cs="Arial"/>
+          <w:sz w:val="28"/>
+          <w:szCs w:val="28"/>
+        </w:rPr>
+        <w:t>,</w:t>
+      </w:r>
+      <w:r>
+        <w:rPr>
+          <w:rFonts w:ascii="Arial" w:hAnsi="Arial" w:cs="Arial"/>
+          <w:sz w:val="28"/>
+          <w:szCs w:val="28"/>
+        </w:rPr>
+        <w:t xml:space="preserve"> multiple readers can hold it simultaneously, but a writer blocks everyone. .read().await acquires a read lock asynchronously so we don't block the runtime waiting for it. Inside the block we grab the filename at current_index and the total count, then clone them out. The block ends, the lock guard drops, and the lock is released before we do anything else. This is deliberate</w:t>
+      </w:r>
+      <w:r>
+        <w:rPr>
+          <w:rFonts w:ascii="Arial" w:hAnsi="Arial" w:cs="Arial"/>
+          <w:sz w:val="28"/>
+          <w:szCs w:val="28"/>
+        </w:rPr>
+        <w:t>,</w:t>
+      </w:r>
+      <w:r>
+        <w:rPr>
+          <w:rFonts w:ascii="Arial" w:hAnsi="Arial" w:cs="Arial"/>
+          <w:sz w:val="28"/>
+          <w:szCs w:val="28"/>
+        </w:rPr>
+        <w:t xml:space="preserve"> you never want to hold a lock across an await point because that would block every other task trying to read the playlist for the entire duration of whatever async operation follows.</w:t>
+      </w:r>
+    </w:p>
+    <w:p>
+      <w:pPr>
+        <w:ind w:left="705"/>
+        <w:rPr>
+          <w:rFonts w:ascii="Arial" w:hAnsi="Arial" w:cs="Arial"/>
+          <w:sz w:val="28"/>
+          <w:szCs w:val="28"/>
+        </w:rPr>
+      </w:pPr>
+    </w:p>
+    <w:p>
+      <w:pPr>
+        <w:ind w:left="705"/>
+        <w:rPr>
+          <w:rFonts w:ascii="Arial" w:hAnsi="Arial" w:cs="Arial"/>
+          <w:sz w:val="28"/>
+          <w:szCs w:val="28"/>
+        </w:rPr>
+      </w:pPr>
+      <w:r>
+        <w:rPr>
+          <w:rFonts w:ascii="Arial" w:hAnsi="Arial" w:cs="Arial"/>
+          <w:sz w:val="28"/>
+          <w:szCs w:val="28"/>
+        </w:rPr>
+        <w:t>now we return</w:t>
+      </w:r>
+      <w:r>
+        <w:rPr>
+          <w:rFonts w:ascii="Arial" w:hAnsi="Arial" w:cs="Arial"/>
+          <w:sz w:val="28"/>
+          <w:szCs w:val="28"/>
+        </w:rPr>
+        <w:t xml:space="preserve"> and</w:t>
+      </w:r>
+      <w:r>
+        <w:rPr>
+          <w:rFonts w:ascii="Arial" w:hAnsi="Arial" w:cs="Arial"/>
+          <w:sz w:val="28"/>
+          <w:szCs w:val="28"/>
+        </w:rPr>
+        <w:t xml:space="preserve"> give this over to Aksama. </w:t>
+      </w:r>
+      <w:r>
+        <w:rPr>
+          <w:rFonts w:ascii="Arial" w:hAnsi="Arial" w:cs="Arial"/>
+          <w:sz w:val="28"/>
+          <w:szCs w:val="28"/>
+        </w:rPr>
+        <w:t xml:space="preserve">PlayerTemplate is </w:t>
+      </w:r>
+      <w:r>
+        <w:rPr>
+          <w:rFonts w:ascii="Arial" w:hAnsi="Arial" w:cs="Arial"/>
+          <w:sz w:val="28"/>
+          <w:szCs w:val="28"/>
+        </w:rPr>
+        <w:t>our</w:t>
+      </w:r>
+      <w:r>
+        <w:rPr>
+          <w:rFonts w:ascii="Arial" w:hAnsi="Arial" w:cs="Arial"/>
+          <w:sz w:val="28"/>
+          <w:szCs w:val="28"/>
+        </w:rPr>
+        <w:t xml:space="preserve"> Rust struct that Askama knows about because it has a #[derive(Template)] attribute and a template(path = "player.html") annotation. Askama is a compile-time template engine</w:t>
+      </w:r>
+      <w:r>
+        <w:rPr>
+          <w:rFonts w:ascii="Arial" w:hAnsi="Arial" w:cs="Arial"/>
+          <w:sz w:val="28"/>
+          <w:szCs w:val="28"/>
+        </w:rPr>
+        <w:t>.</w:t>
+      </w:r>
+      <w:r>
+        <w:rPr>
+          <w:rFonts w:ascii="Arial" w:hAnsi="Arial" w:cs="Arial"/>
+          <w:sz w:val="28"/>
+          <w:szCs w:val="28"/>
+        </w:rPr>
+        <w:t xml:space="preserve"> </w:t>
+      </w:r>
+      <w:r>
+        <w:rPr>
+          <w:rFonts w:ascii="Arial" w:hAnsi="Arial" w:cs="Arial"/>
+          <w:sz w:val="28"/>
+          <w:szCs w:val="28"/>
+        </w:rPr>
+        <w:t>W</w:t>
+      </w:r>
+      <w:r>
+        <w:rPr>
+          <w:rFonts w:ascii="Arial" w:hAnsi="Arial" w:cs="Arial"/>
+          <w:sz w:val="28"/>
+          <w:szCs w:val="28"/>
+        </w:rPr>
+        <w:t>hen you run cargo build, it reads player.html from the dirs listed in askama.toml</w:t>
+      </w:r>
+      <w:r>
+        <w:rPr>
+          <w:rFonts w:ascii="Arial" w:hAnsi="Arial" w:cs="Arial"/>
+          <w:sz w:val="28"/>
+          <w:szCs w:val="28"/>
+        </w:rPr>
+        <w:t>. Aksama generates Rust code something like</w:t>
+      </w:r>
+      <w:r>
+        <w:rPr>
+          <w:rFonts w:ascii="Arial" w:hAnsi="Arial" w:cs="Arial"/>
+          <w:sz w:val="28"/>
+          <w:szCs w:val="28"/>
+        </w:rPr>
+        <w:t>:</w:t>
+      </w:r>
+      <w:r>
+        <w:rPr>
+          <w:rFonts w:ascii="Arial" w:hAnsi="Arial" w:cs="Arial"/>
+          <w:sz w:val="28"/>
+          <w:szCs w:val="28"/>
+        </w:rPr>
+        <w:t xml:space="preserve"> </w:t>
+      </w:r>
+    </w:p>
+    <w:p>
+      <w:pPr>
+        <w:ind w:left="1416"/>
+        <w:rPr>
+          <w:rFonts w:ascii="Arial" w:hAnsi="Arial" w:cs="Arial"/>
+          <w:sz w:val="28"/>
+          <w:szCs w:val="28"/>
+        </w:rPr>
+      </w:pPr>
+      <w:r>
+        <w:rPr>
+          <w:rFonts w:ascii="Arial" w:hAnsi="Arial" w:cs="Arial"/>
+          <w:sz w:val="28"/>
+          <w:szCs w:val="28"/>
+        </w:rPr>
+        <w:t>impl Template for PlayerTemplate {</w:t>
+      </w:r>
+      <w:r>
+        <w:rPr>
+          <w:rFonts w:ascii="Arial" w:hAnsi="Arial" w:cs="Arial"/>
+          <w:sz w:val="28"/>
+          <w:szCs w:val="28"/>
+        </w:rPr>
+        <w:br/>
+      </w:r>
+      <w:r>
+        <w:rPr>
+          <w:rFonts w:ascii="Arial" w:hAnsi="Arial" w:cs="Arial"/>
+          <w:sz w:val="28"/>
+          <w:szCs w:val="28"/>
+        </w:rPr>
+        <w:tab/>
+      </w:r>
+      <w:r>
+        <w:rPr>
+          <w:rFonts w:ascii="Arial" w:hAnsi="Arial" w:cs="Arial"/>
+          <w:sz w:val="28"/>
+          <w:szCs w:val="28"/>
+        </w:rPr>
+        <w:t>fn render(&amp;self) -&gt; Result&lt;String, Error&gt; {</w:t>
+      </w:r>
+      <w:r>
+        <w:rPr>
+          <w:rFonts w:ascii="Arial" w:hAnsi="Arial" w:cs="Arial"/>
+          <w:sz w:val="28"/>
+          <w:szCs w:val="28"/>
+        </w:rPr>
+        <w:br/>
+      </w:r>
+      <w:r>
+        <w:rPr>
+          <w:rFonts w:ascii="Arial" w:hAnsi="Arial" w:cs="Arial"/>
+          <w:sz w:val="28"/>
+          <w:szCs w:val="28"/>
+        </w:rPr>
+        <w:tab/>
+      </w:r>
+      <w:r>
+        <w:rPr>
+          <w:rFonts w:ascii="Arial" w:hAnsi="Arial" w:cs="Arial"/>
+          <w:sz w:val="28"/>
+          <w:szCs w:val="28"/>
+        </w:rPr>
+        <w:tab/>
+      </w:r>
+      <w:r>
+        <w:rPr>
+          <w:rFonts w:ascii="Arial" w:hAnsi="Arial" w:cs="Arial"/>
+          <w:sz w:val="28"/>
+          <w:szCs w:val="28"/>
+        </w:rPr>
+        <w:t>let mut output = String::new();</w:t>
+      </w:r>
+      <w:r>
+        <w:rPr>
+          <w:rFonts w:ascii="Arial" w:hAnsi="Arial" w:cs="Arial"/>
+          <w:sz w:val="28"/>
+          <w:szCs w:val="28"/>
+        </w:rPr>
+        <w:br/>
+      </w:r>
+      <w:r>
+        <w:rPr>
+          <w:rFonts w:ascii="Arial" w:hAnsi="Arial" w:cs="Arial"/>
+          <w:sz w:val="28"/>
+          <w:szCs w:val="28"/>
+        </w:rPr>
+        <w:br/>
+      </w:r>
+      <w:r>
+        <w:rPr>
+          <w:rFonts w:ascii="Arial" w:hAnsi="Arial" w:cs="Arial"/>
+          <w:sz w:val="28"/>
+          <w:szCs w:val="28"/>
+        </w:rPr>
+        <w:tab/>
+      </w:r>
+      <w:r>
+        <w:rPr>
+          <w:rFonts w:ascii="Arial" w:hAnsi="Arial" w:cs="Arial"/>
+          <w:sz w:val="28"/>
+          <w:szCs w:val="28"/>
+        </w:rPr>
+        <w:tab/>
+      </w:r>
+      <w:r>
+        <w:rPr>
+          <w:rFonts w:ascii="Arial" w:hAnsi="Arial" w:cs="Arial"/>
+          <w:sz w:val="28"/>
+          <w:szCs w:val="28"/>
+        </w:rPr>
+        <w:t>output.push_str("&lt;h1&gt;");</w:t>
+      </w:r>
+      <w:r>
+        <w:rPr>
+          <w:rFonts w:ascii="Arial" w:hAnsi="Arial" w:cs="Arial"/>
+          <w:sz w:val="28"/>
+          <w:szCs w:val="28"/>
+        </w:rPr>
+        <w:br/>
+      </w:r>
+      <w:r>
+        <w:rPr>
+          <w:rFonts w:ascii="Arial" w:hAnsi="Arial" w:cs="Arial"/>
+          <w:sz w:val="28"/>
+          <w:szCs w:val="28"/>
+        </w:rPr>
+        <w:tab/>
+      </w:r>
+      <w:r>
+        <w:rPr>
+          <w:rFonts w:ascii="Arial" w:hAnsi="Arial" w:cs="Arial"/>
+          <w:sz w:val="28"/>
+          <w:szCs w:val="28"/>
+        </w:rPr>
+        <w:tab/>
+      </w:r>
+      <w:r>
+        <w:rPr>
+          <w:rFonts w:ascii="Arial" w:hAnsi="Arial" w:cs="Arial"/>
+          <w:sz w:val="28"/>
+          <w:szCs w:val="28"/>
+        </w:rPr>
+        <w:t>output.push_str(&amp;self.title);</w:t>
+      </w:r>
+      <w:r>
+        <w:rPr>
+          <w:rFonts w:ascii="Arial" w:hAnsi="Arial" w:cs="Arial"/>
+          <w:sz w:val="28"/>
+          <w:szCs w:val="28"/>
+        </w:rPr>
+        <w:br/>
+      </w:r>
+      <w:r>
+        <w:rPr>
+          <w:rFonts w:ascii="Arial" w:hAnsi="Arial" w:cs="Arial"/>
+          <w:sz w:val="28"/>
+          <w:szCs w:val="28"/>
+        </w:rPr>
+        <w:tab/>
+      </w:r>
+      <w:r>
+        <w:rPr>
+          <w:rFonts w:ascii="Arial" w:hAnsi="Arial" w:cs="Arial"/>
+          <w:sz w:val="28"/>
+          <w:szCs w:val="28"/>
+        </w:rPr>
+        <w:tab/>
+      </w:r>
+      <w:r>
+        <w:rPr>
+          <w:rFonts w:ascii="Arial" w:hAnsi="Arial" w:cs="Arial"/>
+          <w:sz w:val="28"/>
+          <w:szCs w:val="28"/>
+        </w:rPr>
+        <w:t>output.push_str("&lt;/h1&gt;");</w:t>
+      </w:r>
+      <w:r>
+        <w:rPr>
+          <w:rFonts w:ascii="Arial" w:hAnsi="Arial" w:cs="Arial"/>
+          <w:sz w:val="28"/>
+          <w:szCs w:val="28"/>
+        </w:rPr>
+        <w:br/>
+      </w:r>
+      <w:r>
+        <w:rPr>
+          <w:rFonts w:ascii="Arial" w:hAnsi="Arial" w:cs="Arial"/>
+          <w:sz w:val="28"/>
+          <w:szCs w:val="28"/>
+        </w:rPr>
+        <w:br/>
+      </w:r>
+      <w:r>
+        <w:rPr>
+          <w:rFonts w:ascii="Arial" w:hAnsi="Arial" w:cs="Arial"/>
+          <w:sz w:val="28"/>
+          <w:szCs w:val="28"/>
+        </w:rPr>
+        <w:tab/>
+      </w:r>
+      <w:r>
+        <w:rPr>
+          <w:rFonts w:ascii="Arial" w:hAnsi="Arial" w:cs="Arial"/>
+          <w:sz w:val="28"/>
+          <w:szCs w:val="28"/>
+        </w:rPr>
+        <w:tab/>
+      </w:r>
+      <w:r>
+        <w:rPr>
+          <w:rFonts w:ascii="Arial" w:hAnsi="Arial" w:cs="Arial"/>
+          <w:sz w:val="28"/>
+          <w:szCs w:val="28"/>
+        </w:rPr>
+        <w:t>Ok(output)</w:t>
+      </w:r>
+      <w:r>
+        <w:rPr>
+          <w:rFonts w:ascii="Arial" w:hAnsi="Arial" w:cs="Arial"/>
+          <w:sz w:val="28"/>
+          <w:szCs w:val="28"/>
+        </w:rPr>
+        <w:br/>
+      </w:r>
+      <w:r>
+        <w:rPr>
+          <w:rFonts w:ascii="Arial" w:hAnsi="Arial" w:cs="Arial"/>
+          <w:sz w:val="28"/>
+          <w:szCs w:val="28"/>
+        </w:rPr>
+        <w:tab/>
+      </w:r>
+      <w:r>
+        <w:rPr>
+          <w:rFonts w:ascii="Arial" w:hAnsi="Arial" w:cs="Arial"/>
+          <w:sz w:val="28"/>
+          <w:szCs w:val="28"/>
+        </w:rPr>
+        <w:t>}</w:t>
+      </w:r>
+      <w:r>
+        <w:rPr>
+          <w:rFonts w:ascii="Arial" w:hAnsi="Arial" w:cs="Arial"/>
+          <w:sz w:val="28"/>
+          <w:szCs w:val="28"/>
+        </w:rPr>
+        <w:br/>
+        <w:t>}</w:t>
+      </w:r>
+    </w:p>
+    <w:p>
+      <w:pPr>
+        <w:ind w:left="705"/>
+        <w:rPr>
+          <w:rFonts w:ascii="Arial" w:hAnsi="Arial" w:cs="Arial"/>
+          <w:sz w:val="28"/>
+          <w:szCs w:val="28"/>
+        </w:rPr>
+      </w:pPr>
+      <w:r>
+        <w:rPr>
+          <w:rFonts w:ascii="Arial" w:hAnsi="Arial" w:cs="Arial"/>
+          <w:sz w:val="28"/>
+          <w:szCs w:val="28"/>
+        </w:rPr>
+        <w:t>i</w:t>
+      </w:r>
+      <w:r>
+        <w:rPr>
+          <w:rFonts w:ascii="Arial" w:hAnsi="Arial" w:cs="Arial"/>
+          <w:sz w:val="28"/>
+          <w:szCs w:val="28"/>
+        </w:rPr>
+        <w:t>t finds every {{ variable }} in the HTML and generates a Rust impl Template for PlayerTemplate that does string rendering. By the time the binary runs, there is no file reading, no template parsing</w:t>
+      </w:r>
+      <w:r>
+        <w:rPr>
+          <w:rFonts w:ascii="Arial" w:hAnsi="Arial" w:cs="Arial"/>
+          <w:sz w:val="28"/>
+          <w:szCs w:val="28"/>
+        </w:rPr>
+        <w:t xml:space="preserve"> </w:t>
+      </w:r>
+      <w:r>
+        <w:rPr>
+          <w:rFonts w:ascii="Arial" w:hAnsi="Arial" w:cs="Arial"/>
+          <w:sz w:val="28"/>
+          <w:szCs w:val="28"/>
+        </w:rPr>
+        <w:t>–</w:t>
+      </w:r>
+      <w:r>
+        <w:rPr>
+          <w:rFonts w:ascii="Arial" w:hAnsi="Arial" w:cs="Arial"/>
+          <w:sz w:val="28"/>
+          <w:szCs w:val="28"/>
+        </w:rPr>
+        <w:t xml:space="preserve"> </w:t>
+      </w:r>
+      <w:r>
+        <w:rPr>
+          <w:rFonts w:ascii="Arial" w:hAnsi="Arial" w:cs="Arial"/>
+          <w:sz w:val="28"/>
+          <w:szCs w:val="28"/>
+        </w:rPr>
+        <w:t xml:space="preserve"> it's all inlined Rust code that just formats a string.</w:t>
+      </w:r>
+    </w:p>
+    <w:p>
+      <w:pPr>
+        <w:ind w:left="705"/>
+        <w:rPr>
+          <w:rFonts w:ascii="Arial" w:hAnsi="Arial" w:cs="Arial"/>
+          <w:sz w:val="28"/>
+          <w:szCs w:val="28"/>
+        </w:rPr>
+      </w:pPr>
+      <w:r>
+        <w:rPr>
+          <w:rFonts w:ascii="Arial" w:hAnsi="Arial" w:cs="Arial"/>
+          <w:sz w:val="28"/>
+          <w:szCs w:val="28"/>
+        </w:rPr>
+        <w:lastRenderedPageBreak/>
+        <w:t>w</w:t>
+      </w:r>
+      <w:r>
+        <w:rPr>
+          <w:rFonts w:ascii="Arial" w:hAnsi="Arial" w:cs="Arial"/>
+          <w:sz w:val="28"/>
+          <w:szCs w:val="28"/>
+        </w:rPr>
+        <w:t>hen Axum calls the handler and gets back a PlayerTemplate, it calls the Askama-generated render() method on it, which produces the final HTML string with all the {{ }} placeholders replaced by the actual values</w:t>
+      </w:r>
+      <w:r>
+        <w:rPr>
+          <w:rFonts w:ascii="Arial" w:hAnsi="Arial" w:cs="Arial"/>
+          <w:sz w:val="28"/>
+          <w:szCs w:val="28"/>
+        </w:rPr>
+        <w:t>,</w:t>
+      </w:r>
+      <w:r>
+        <w:rPr>
+          <w:rFonts w:ascii="Arial" w:hAnsi="Arial" w:cs="Arial"/>
+          <w:sz w:val="28"/>
+          <w:szCs w:val="28"/>
+        </w:rPr>
+        <w:t xml:space="preserve"> current_media becomes the filename, current_index becomes the track number, and so on.</w:t>
+      </w:r>
+    </w:p>
+    <w:p>
+      <w:pPr>
+        <w:ind w:left="705"/>
+        <w:rPr>
+          <w:rFonts w:ascii="Arial" w:hAnsi="Arial" w:cs="Arial"/>
+          <w:sz w:val="28"/>
+          <w:szCs w:val="28"/>
+        </w:rPr>
+      </w:pPr>
+      <w:r>
+        <w:rPr>
+          <w:rFonts w:ascii="Arial" w:hAnsi="Arial" w:cs="Arial"/>
+          <w:sz w:val="28"/>
+          <w:szCs w:val="28"/>
+        </w:rPr>
+        <w:t>Axum then wraps that string in an HTTP response with Content-Type: text/html and sends it back down the TCP connection to the browser.</w:t>
+      </w:r>
+    </w:p>
+    <w:p>
+      <w:pPr>
+        <w:rPr>
+          <w:rFonts w:ascii="Arial" w:hAnsi="Arial" w:cs="Arial"/>
+          <w:sz w:val="28"/>
+          <w:szCs w:val="28"/>
+        </w:rPr>
+      </w:pPr>
+    </w:p>
+    <w:p>
+      <w:pPr>
+        <w:rPr>
+          <w:rFonts w:ascii="Arial" w:hAnsi="Arial" w:cs="Arial"/>
+          <w:sz w:val="28"/>
+          <w:szCs w:val="28"/>
+        </w:rPr>
+      </w:pPr>
+      <w:r>
+        <w:rPr>
+          <w:rFonts w:ascii="Arial" w:hAnsi="Arial" w:cs="Arial"/>
+          <w:sz w:val="28"/>
+          <w:szCs w:val="28"/>
+        </w:rPr>
+        <w:t>aight! The browser now has HTML. But what does it does with it is a thing worth mentioning.</w:t>
+      </w:r>
+    </w:p>
+    <w:p>
+      <w:pPr>
+        <w:rPr>
+          <w:rFonts w:ascii="Arial" w:hAnsi="Arial" w:cs="Arial"/>
+          <w:sz w:val="28"/>
+          <w:szCs w:val="28"/>
+        </w:rPr>
+      </w:pPr>
+      <w:r>
+        <w:rPr>
+          <w:rFonts w:ascii="Arial" w:hAnsi="Arial" w:cs="Arial"/>
+          <w:sz w:val="28"/>
+          <w:szCs w:val="28"/>
+        </w:rPr>
+        <w:t xml:space="preserve">it starts parsing it and immediately comes across </w:t>
+      </w:r>
+      <w:r>
+        <w:rPr>
+          <w:rFonts w:ascii="Arial" w:hAnsi="Arial" w:cs="Arial"/>
+          <w:sz w:val="28"/>
+          <w:szCs w:val="28"/>
+        </w:rPr>
+        <w:t>&lt;link rel="stylesheet" href="/stargzr/static/css/player.css" /&gt;</w:t>
+      </w:r>
+      <w:r>
+        <w:rPr>
+          <w:rFonts w:ascii="Arial" w:hAnsi="Arial" w:cs="Arial"/>
+          <w:sz w:val="28"/>
+          <w:szCs w:val="28"/>
+        </w:rPr>
+        <w:t xml:space="preserve">. </w:t>
+      </w:r>
+      <w:r>
+        <w:rPr>
+          <w:rFonts w:ascii="Arial" w:hAnsi="Arial" w:cs="Arial"/>
+          <w:sz w:val="28"/>
+          <w:szCs w:val="28"/>
+        </w:rPr>
+        <w:t>This triggers a new HTTP GET request to /stargzr/static/css/player.css. Back in the router, this path matches the nest_service mount that points ServeDir at the static/ folder on disk</w:t>
+      </w:r>
+      <w:r>
+        <w:rPr>
+          <w:rFonts w:ascii="Arial" w:hAnsi="Arial" w:cs="Arial"/>
+          <w:sz w:val="28"/>
+          <w:szCs w:val="28"/>
+        </w:rPr>
+        <w:t xml:space="preserve"> </w:t>
+      </w:r>
+      <w:r>
+        <w:rPr>
+          <w:rFonts w:ascii="Arial" w:hAnsi="Arial" w:cs="Arial"/>
+          <w:sz w:val="28"/>
+          <w:szCs w:val="28"/>
+        </w:rPr>
+        <w:t>–</w:t>
+      </w:r>
+      <w:r>
+        <w:rPr>
+          <w:rFonts w:ascii="Arial" w:hAnsi="Arial" w:cs="Arial"/>
+          <w:sz w:val="28"/>
+          <w:szCs w:val="28"/>
+        </w:rPr>
+        <w:t xml:space="preserve"> </w:t>
+      </w:r>
+      <w:r>
+        <w:rPr>
+          <w:rFonts w:ascii="Arial" w:hAnsi="Arial" w:cs="Arial"/>
+          <w:sz w:val="28"/>
+          <w:szCs w:val="28"/>
+        </w:rPr>
+        <w:t>so Axum finds the file and serves it. Same thing happens for every &lt;script src="..."&gt; tag at the bottom of the page. Each one is a separate HTTP request, each one routed to ServeDir</w:t>
+      </w:r>
+      <w:r>
+        <w:rPr>
+          <w:rFonts w:ascii="Arial" w:hAnsi="Arial" w:cs="Arial"/>
+          <w:sz w:val="28"/>
+          <w:szCs w:val="28"/>
+        </w:rPr>
+        <w:t xml:space="preserve"> (</w:t>
+      </w:r>
+      <w:r>
+        <w:rPr>
+          <w:rFonts w:ascii="Arial" w:hAnsi="Arial" w:cs="Arial"/>
+          <w:sz w:val="28"/>
+          <w:szCs w:val="28"/>
+        </w:rPr>
+        <w:t>behaves like a static file server</w:t>
+      </w:r>
+      <w:r>
+        <w:rPr>
+          <w:rFonts w:ascii="Arial" w:hAnsi="Arial" w:cs="Arial"/>
+          <w:sz w:val="28"/>
+          <w:szCs w:val="28"/>
+        </w:rPr>
+        <w:t>)</w:t>
+      </w:r>
+      <w:r>
+        <w:rPr>
+          <w:rFonts w:ascii="Arial" w:hAnsi="Arial" w:cs="Arial"/>
+          <w:sz w:val="28"/>
+          <w:szCs w:val="28"/>
+        </w:rPr>
+        <w:t>, each one returning the file contents.</w:t>
+      </w:r>
+    </w:p>
+    <w:p>
+      <w:pPr>
+        <w:rPr>
+          <w:rFonts w:ascii="Arial" w:hAnsi="Arial" w:cs="Arial"/>
+          <w:sz w:val="28"/>
+          <w:szCs w:val="28"/>
+        </w:rPr>
+      </w:pPr>
+      <w:r>
+        <w:rPr>
+          <w:rFonts w:ascii="Arial" w:hAnsi="Arial" w:cs="Arial"/>
+          <w:sz w:val="28"/>
+          <w:szCs w:val="28"/>
+        </w:rPr>
+        <w:t>t</w:t>
+      </w:r>
+      <w:r>
+        <w:rPr>
+          <w:rFonts w:ascii="Arial" w:hAnsi="Arial" w:cs="Arial"/>
+          <w:sz w:val="28"/>
+          <w:szCs w:val="28"/>
+        </w:rPr>
+        <w:t xml:space="preserve">he defer attribute on the script tags means the browser downloads them in parallel but doesn't execute them until the HTML is fully parsed </w:t>
+      </w:r>
+      <w:r>
+        <w:rPr>
+          <w:rFonts w:ascii="Arial" w:hAnsi="Arial" w:cs="Arial"/>
+          <w:sz w:val="28"/>
+          <w:szCs w:val="28"/>
+        </w:rPr>
+        <w:t>–</w:t>
+      </w:r>
+      <w:r>
+        <w:rPr>
+          <w:rFonts w:ascii="Arial" w:hAnsi="Arial" w:cs="Arial"/>
+          <w:sz w:val="28"/>
+          <w:szCs w:val="28"/>
+        </w:rPr>
+        <w:t xml:space="preserve"> which is why load order in the comments matters, since defer preserves document order.</w:t>
+      </w:r>
+    </w:p>
+    <w:p>
+      <w:pPr>
+        <w:rPr>
+          <w:rFonts w:ascii="Arial" w:hAnsi="Arial" w:cs="Arial"/>
+          <w:sz w:val="28"/>
+          <w:szCs w:val="28"/>
+        </w:rPr>
+      </w:pPr>
+    </w:p>
+    <w:p>
+      <w:pPr>
+        <w:rPr>
+          <w:rFonts w:ascii="Arial" w:hAnsi="Arial" w:cs="Arial"/>
+          <w:sz w:val="28"/>
+          <w:szCs w:val="28"/>
+        </w:rPr>
+      </w:pPr>
+      <w:r>
+        <w:rPr>
+          <w:rFonts w:ascii="Arial" w:hAnsi="Arial" w:cs="Arial"/>
+          <w:sz w:val="28"/>
+          <w:szCs w:val="28"/>
+        </w:rPr>
+        <w:t>okey dokey, we have the HTML all the scripts and styles fetched...which means... it’s JS timeee. You can read more about the script laod order reasoning. For now lets talk about admin.js and main.js because they are the only one that run code immediately. We might get in the others some more if need be.</w:t>
+      </w:r>
+    </w:p>
+    <w:p>
+      <w:pPr>
+        <w:rPr>
+          <w:rFonts w:ascii="Arial" w:hAnsi="Arial" w:cs="Arial"/>
+          <w:sz w:val="28"/>
+          <w:szCs w:val="28"/>
+        </w:rPr>
+      </w:pPr>
+      <w:r>
+        <w:rPr>
+          <w:rFonts w:ascii="Arial" w:hAnsi="Arial" w:cs="Arial"/>
+          <w:sz w:val="28"/>
+          <w:szCs w:val="28"/>
+        </w:rPr>
+        <w:t xml:space="preserve">first, </w:t>
+      </w:r>
+    </w:p>
+    <w:p>
+      <w:pPr>
+        <w:ind w:left="705"/>
+        <w:rPr>
+          <w:rFonts w:ascii="Arial" w:hAnsi="Arial" w:cs="Arial"/>
+          <w:sz w:val="28"/>
+          <w:szCs w:val="28"/>
+        </w:rPr>
+      </w:pPr>
+      <w:r>
+        <w:rPr>
+          <w:rFonts w:ascii="Arial" w:hAnsi="Arial" w:cs="Arial"/>
+          <w:sz w:val="28"/>
+          <w:szCs w:val="28"/>
+        </w:rPr>
+        <w:t>admin.js</w:t>
+      </w:r>
+      <w:r>
+        <w:rPr>
+          <w:rFonts w:ascii="Arial" w:hAnsi="Arial" w:cs="Arial"/>
+          <w:sz w:val="28"/>
+          <w:szCs w:val="28"/>
+        </w:rPr>
+        <w:t xml:space="preserve"> </w:t>
+      </w:r>
+      <w:r>
+        <w:rPr>
+          <w:rFonts w:ascii="Arial" w:hAnsi="Arial" w:cs="Arial"/>
+          <w:sz w:val="28"/>
+          <w:szCs w:val="28"/>
+        </w:rPr>
+        <w:t xml:space="preserve">immediately starts its own independent runtime loop. Its responsibility is observability rather than playback </w:t>
+      </w:r>
+      <w:r>
+        <w:rPr>
+          <w:rFonts w:ascii="Arial" w:hAnsi="Arial" w:cs="Arial"/>
+          <w:sz w:val="28"/>
+          <w:szCs w:val="28"/>
+        </w:rPr>
+        <w:t>–</w:t>
+      </w:r>
+      <w:r>
+        <w:rPr>
+          <w:rFonts w:ascii="Arial" w:hAnsi="Arial" w:cs="Arial"/>
+          <w:sz w:val="28"/>
+          <w:szCs w:val="28"/>
+        </w:rPr>
+        <w:t xml:space="preserve"> </w:t>
+      </w:r>
+      <w:r>
+        <w:rPr>
+          <w:rFonts w:ascii="Arial" w:hAnsi="Arial" w:cs="Arial"/>
+          <w:sz w:val="28"/>
+          <w:szCs w:val="28"/>
+        </w:rPr>
+        <w:t>it periodically requests the server’s administrative state and renders a snapshot of what the backend currently knows about active sessions and listener relationships.</w:t>
+      </w:r>
+    </w:p>
+    <w:p>
+      <w:pPr>
+        <w:rPr>
+          <w:rFonts w:ascii="Arial" w:hAnsi="Arial" w:cs="Arial"/>
+          <w:sz w:val="28"/>
+          <w:szCs w:val="28"/>
+        </w:rPr>
+      </w:pPr>
+      <w:r>
+        <w:rPr>
+          <w:rFonts w:ascii="Arial" w:hAnsi="Arial" w:cs="Arial"/>
+          <w:sz w:val="28"/>
+          <w:szCs w:val="28"/>
+        </w:rPr>
+        <w:lastRenderedPageBreak/>
+        <w:t xml:space="preserve">second, </w:t>
+      </w:r>
+    </w:p>
+    <w:p>
+      <w:pPr>
+        <w:ind w:left="705"/>
+        <w:rPr>
+          <w:rFonts w:ascii="Arial" w:hAnsi="Arial" w:cs="Arial"/>
+          <w:sz w:val="28"/>
+          <w:szCs w:val="28"/>
+        </w:rPr>
+      </w:pPr>
+      <w:r>
+        <w:rPr>
+          <w:rFonts w:ascii="Arial" w:hAnsi="Arial" w:cs="Arial"/>
+          <w:sz w:val="28"/>
+          <w:szCs w:val="28"/>
+        </w:rPr>
+        <w:t>main.js</w:t>
+      </w:r>
+      <w:r>
+        <w:rPr>
+          <w:rFonts w:ascii="Arial" w:hAnsi="Arial" w:cs="Arial"/>
+          <w:sz w:val="28"/>
+          <w:szCs w:val="28"/>
+        </w:rPr>
+        <w:t xml:space="preserve">, </w:t>
+      </w:r>
+      <w:r>
+        <w:rPr>
+          <w:rFonts w:ascii="Arial" w:hAnsi="Arial" w:cs="Arial"/>
+          <w:sz w:val="28"/>
+          <w:szCs w:val="28"/>
+        </w:rPr>
+        <w:t>It grabs the &lt;audio&gt; and &lt;video&gt; elements and sets window._activeMedia to the audio element by default. Video is hidden initially. This allows the switchMediaElement() function to swap between audio and video whenever needed, and ensures every part of the code can talk to _activeMedia without caring which element is visible.</w:t>
+      </w:r>
+    </w:p>
+    <w:p>
+      <w:pPr>
+        <w:ind w:left="705"/>
+        <w:rPr>
+          <w:rFonts w:ascii="Arial" w:hAnsi="Arial" w:cs="Arial"/>
+          <w:sz w:val="28"/>
+          <w:szCs w:val="28"/>
+        </w:rPr>
+      </w:pPr>
+      <w:r>
+        <w:rPr>
+          <w:rFonts w:ascii="Arial" w:hAnsi="Arial" w:cs="Arial"/>
+          <w:sz w:val="28"/>
+          <w:szCs w:val="28"/>
+        </w:rPr>
+        <w:t>b</w:t>
+      </w:r>
+      <w:r>
+        <w:rPr>
+          <w:rFonts w:ascii="Arial" w:hAnsi="Arial" w:cs="Arial"/>
+          <w:sz w:val="28"/>
+          <w:szCs w:val="28"/>
+        </w:rPr>
+        <w:t xml:space="preserve">luetooth mode toggle is initialized. </w:t>
+      </w:r>
+      <w:r>
+        <w:rPr>
+          <w:rFonts w:ascii="Arial" w:hAnsi="Arial" w:cs="Arial"/>
+          <w:sz w:val="28"/>
+          <w:szCs w:val="28"/>
+        </w:rPr>
+        <w:t>m</w:t>
+      </w:r>
+      <w:r>
+        <w:rPr>
+          <w:rFonts w:ascii="Arial" w:hAnsi="Arial" w:cs="Arial"/>
+          <w:sz w:val="28"/>
+          <w:szCs w:val="28"/>
+        </w:rPr>
+        <w:t>ain.js reads localStorage to see if Bluetooth mode is enabled from a previous session, checks the toggle box accordingly, and sets up listeners to update the stored value when the user changes it. When Bluetooth mode is on, seeking or media switching temporarily mutes playback to avoid audio glitches, then unmutes automatically after a short delay.</w:t>
+      </w:r>
+    </w:p>
+    <w:p>
+      <w:pPr>
+        <w:ind w:left="705"/>
+        <w:rPr>
+          <w:rFonts w:ascii="Arial" w:hAnsi="Arial" w:cs="Arial"/>
+          <w:sz w:val="28"/>
+          <w:szCs w:val="28"/>
+        </w:rPr>
+      </w:pPr>
+      <w:r>
+        <w:rPr>
+          <w:rFonts w:ascii="Arial" w:hAnsi="Arial" w:cs="Arial"/>
+          <w:sz w:val="28"/>
+          <w:szCs w:val="28"/>
+        </w:rPr>
+        <w:t>i</w:t>
+      </w:r>
+      <w:r>
+        <w:rPr>
+          <w:rFonts w:ascii="Arial" w:hAnsi="Arial" w:cs="Arial"/>
+          <w:sz w:val="28"/>
+          <w:szCs w:val="28"/>
+        </w:rPr>
+        <w:t>t patches both audio and video elements so play() is seek-aware: if a seek is pending, playback is deferred until the element has finished seeking. This prevents the player from playing at the wrong position.</w:t>
+      </w:r>
+    </w:p>
+    <w:p>
+      <w:pPr>
+        <w:ind w:left="705"/>
+        <w:rPr>
+          <w:rFonts w:ascii="Arial" w:hAnsi="Arial" w:cs="Arial"/>
+          <w:sz w:val="28"/>
+          <w:szCs w:val="28"/>
+        </w:rPr>
+      </w:pPr>
+    </w:p>
+    <w:p>
+      <w:pPr>
+        <w:ind w:left="705"/>
+        <w:rPr>
+          <w:rFonts w:ascii="Arial" w:hAnsi="Arial" w:cs="Arial"/>
+          <w:sz w:val="28"/>
+          <w:szCs w:val="28"/>
+        </w:rPr>
+      </w:pPr>
+      <w:r>
+        <w:rPr>
+          <w:rFonts w:ascii="Arial" w:hAnsi="Arial" w:cs="Arial"/>
+          <w:sz w:val="28"/>
+          <w:szCs w:val="28"/>
+        </w:rPr>
+        <w:t>i</w:t>
+      </w:r>
+      <w:r>
+        <w:rPr>
+          <w:rFonts w:ascii="Arial" w:hAnsi="Arial" w:cs="Arial"/>
+          <w:sz w:val="28"/>
+          <w:szCs w:val="28"/>
+        </w:rPr>
+        <w:t>t wires shared event handlers to both media elements:</w:t>
+      </w:r>
+    </w:p>
+    <w:p>
+      <w:pPr>
+        <w:numPr>
+          <w:ilvl w:val="0"/>
+          <w:numId w:val="3"/>
+        </w:numPr>
+        <w:rPr>
+          <w:rFonts w:ascii="Arial" w:hAnsi="Arial" w:cs="Arial"/>
+          <w:sz w:val="28"/>
+          <w:szCs w:val="28"/>
+        </w:rPr>
+      </w:pPr>
+      <w:r>
+        <w:rPr>
+          <w:rFonts w:ascii="Arial" w:hAnsi="Arial" w:cs="Arial"/>
+          <w:sz w:val="28"/>
+          <w:szCs w:val="28"/>
+        </w:rPr>
+        <w:t xml:space="preserve">seeking sets a flag and triggers Bluetooth muting if needed. </w:t>
+      </w:r>
+    </w:p>
+    <w:p>
+      <w:pPr>
+        <w:numPr>
+          <w:ilvl w:val="0"/>
+          <w:numId w:val="3"/>
+        </w:numPr>
+        <w:rPr>
+          <w:rFonts w:ascii="Arial" w:hAnsi="Arial" w:cs="Arial"/>
+          <w:sz w:val="28"/>
+          <w:szCs w:val="28"/>
+        </w:rPr>
+      </w:pPr>
+      <w:r>
+        <w:rPr>
+          <w:rFonts w:ascii="Arial" w:hAnsi="Arial" w:cs="Arial"/>
+          <w:sz w:val="28"/>
+          <w:szCs w:val="28"/>
+        </w:rPr>
+        <w:t xml:space="preserve">seeked clears the flag. </w:t>
+      </w:r>
+    </w:p>
+    <w:p>
+      <w:pPr>
+        <w:numPr>
+          <w:ilvl w:val="0"/>
+          <w:numId w:val="3"/>
+        </w:numPr>
+        <w:rPr>
+          <w:rFonts w:ascii="Arial" w:hAnsi="Arial" w:cs="Arial"/>
+          <w:sz w:val="28"/>
+          <w:szCs w:val="28"/>
+        </w:rPr>
+      </w:pPr>
+      <w:r>
+        <w:rPr>
+          <w:rFonts w:ascii="Arial" w:hAnsi="Arial" w:cs="Arial"/>
+          <w:sz w:val="28"/>
+          <w:szCs w:val="28"/>
+        </w:rPr>
+        <w:t xml:space="preserve">playing unmutes if Bluetooth mode was temporarily muting. </w:t>
+      </w:r>
+    </w:p>
+    <w:p>
+      <w:pPr>
+        <w:numPr>
+          <w:ilvl w:val="0"/>
+          <w:numId w:val="3"/>
+        </w:numPr>
+        <w:rPr>
+          <w:rFonts w:ascii="Arial" w:hAnsi="Arial" w:cs="Arial"/>
+          <w:sz w:val="28"/>
+          <w:szCs w:val="28"/>
+        </w:rPr>
+      </w:pPr>
+      <w:r>
+        <w:rPr>
+          <w:rFonts w:ascii="Arial" w:hAnsi="Arial" w:cs="Arial"/>
+          <w:sz w:val="28"/>
+          <w:szCs w:val="28"/>
+        </w:rPr>
+        <w:t xml:space="preserve">ended triggers different behaviors: </w:t>
+      </w:r>
+    </w:p>
+    <w:p>
+      <w:pPr>
+        <w:numPr>
+          <w:ilvl w:val="1"/>
+          <w:numId w:val="3"/>
+        </w:numPr>
+        <w:rPr>
+          <w:rFonts w:ascii="Arial" w:hAnsi="Arial" w:cs="Arial"/>
+          <w:sz w:val="28"/>
+          <w:szCs w:val="28"/>
+        </w:rPr>
+      </w:pPr>
+      <w:r>
+        <w:rPr>
+          <w:rFonts w:ascii="Arial" w:hAnsi="Arial" w:cs="Arial"/>
+          <w:sz w:val="28"/>
+          <w:szCs w:val="28"/>
+        </w:rPr>
+        <w:t xml:space="preserve">If in radio mode, it waits for AutoNext or broadcaster sync. </w:t>
+      </w:r>
+    </w:p>
+    <w:p>
+      <w:pPr>
+        <w:numPr>
+          <w:ilvl w:val="1"/>
+          <w:numId w:val="3"/>
+        </w:numPr>
+        <w:rPr>
+          <w:rFonts w:ascii="Arial" w:hAnsi="Arial" w:cs="Arial"/>
+          <w:sz w:val="28"/>
+          <w:szCs w:val="28"/>
+        </w:rPr>
+      </w:pPr>
+      <w:r>
+        <w:rPr>
+          <w:rFonts w:ascii="Arial" w:hAnsi="Arial" w:cs="Arial"/>
+          <w:sz w:val="28"/>
+          <w:szCs w:val="28"/>
+        </w:rPr>
+        <w:t xml:space="preserve">If broadcasting, it tells the server to move to the next track. </w:t>
+      </w:r>
+    </w:p>
+    <w:p>
+      <w:pPr>
+        <w:numPr>
+          <w:ilvl w:val="1"/>
+          <w:numId w:val="3"/>
+        </w:numPr>
+        <w:rPr>
+          <w:rFonts w:ascii="Arial" w:hAnsi="Arial" w:cs="Arial"/>
+          <w:sz w:val="28"/>
+          <w:szCs w:val="28"/>
+        </w:rPr>
+      </w:pPr>
+      <w:r>
+        <w:rPr>
+          <w:rFonts w:ascii="Arial" w:hAnsi="Arial" w:cs="Arial"/>
+          <w:sz w:val="28"/>
+          <w:szCs w:val="28"/>
+        </w:rPr>
+        <w:t xml:space="preserve">Otherwise, it plays the next track in the playlist. </w:t>
+      </w:r>
+    </w:p>
+    <w:p>
+      <w:pPr>
+        <w:numPr>
+          <w:ilvl w:val="0"/>
+          <w:numId w:val="3"/>
+        </w:numPr>
+        <w:rPr>
+          <w:rFonts w:ascii="Arial" w:hAnsi="Arial" w:cs="Arial"/>
+          <w:sz w:val="28"/>
+          <w:szCs w:val="28"/>
+        </w:rPr>
+      </w:pPr>
+      <w:r>
+        <w:rPr>
+          <w:rFonts w:ascii="Arial" w:hAnsi="Arial" w:cs="Arial"/>
+          <w:sz w:val="28"/>
+          <w:szCs w:val="28"/>
+        </w:rPr>
+        <w:t xml:space="preserve">timeupdate updates the progress bar and timer if tuned into a broadcaster. </w:t>
+      </w:r>
+    </w:p>
+    <w:p>
+      <w:pPr>
+        <w:numPr>
+          <w:ilvl w:val="0"/>
+          <w:numId w:val="3"/>
+        </w:numPr>
+        <w:rPr>
+          <w:rFonts w:ascii="Arial" w:hAnsi="Arial" w:cs="Arial"/>
+          <w:sz w:val="28"/>
+          <w:szCs w:val="28"/>
+        </w:rPr>
+      </w:pPr>
+      <w:r>
+        <w:rPr>
+          <w:rFonts w:ascii="Arial" w:hAnsi="Arial" w:cs="Arial"/>
+          <w:sz w:val="28"/>
+          <w:szCs w:val="28"/>
+        </w:rPr>
+        <w:lastRenderedPageBreak/>
+        <w:t>play checks session validity on the server and updates OS-level media session metadata so notifications show the current track.</w:t>
+      </w:r>
+    </w:p>
+    <w:p>
+      <w:pPr>
+        <w:ind w:left="708"/>
+        <w:rPr>
+          <w:rFonts w:ascii="Arial" w:hAnsi="Arial" w:cs="Arial"/>
+          <w:sz w:val="28"/>
+          <w:szCs w:val="28"/>
+        </w:rPr>
+      </w:pPr>
+    </w:p>
+    <w:p>
+      <w:pPr>
+        <w:ind w:left="708"/>
+        <w:rPr>
+          <w:rFonts w:ascii="Arial" w:hAnsi="Arial" w:cs="Arial"/>
+          <w:sz w:val="28"/>
+          <w:szCs w:val="28"/>
+        </w:rPr>
+      </w:pPr>
+      <w:r>
+        <w:rPr>
+          <w:rFonts w:ascii="Arial" w:hAnsi="Arial" w:cs="Arial"/>
+          <w:sz w:val="28"/>
+          <w:szCs w:val="28"/>
+        </w:rPr>
+        <w:t>n</w:t>
+      </w:r>
+      <w:r>
+        <w:rPr>
+          <w:rFonts w:ascii="Arial" w:hAnsi="Arial" w:cs="Arial"/>
+          <w:sz w:val="28"/>
+          <w:szCs w:val="28"/>
+        </w:rPr>
+        <w:t>ext, Media Session API is initialized. If the browser supports it, main.js registers handlers for play, pause, next, and previous. These handlers are persistent and automatically updated with each track’s metadata, so OS notifications always show the correct title and respond to hardware/media keys.</w:t>
+      </w:r>
+    </w:p>
+    <w:p>
+      <w:pPr>
+        <w:ind w:left="708"/>
+        <w:rPr>
+          <w:rFonts w:ascii="Arial" w:hAnsi="Arial" w:cs="Arial"/>
+          <w:sz w:val="28"/>
+          <w:szCs w:val="28"/>
+        </w:rPr>
+      </w:pPr>
+    </w:p>
+    <w:p>
+      <w:pPr>
+        <w:ind w:left="708"/>
+        <w:rPr>
+          <w:rFonts w:ascii="Arial" w:hAnsi="Arial" w:cs="Arial"/>
+          <w:sz w:val="28"/>
+          <w:szCs w:val="28"/>
+        </w:rPr>
+      </w:pPr>
+      <w:r>
+        <w:rPr>
+          <w:rFonts w:ascii="Arial" w:hAnsi="Arial" w:cs="Arial"/>
+          <w:sz w:val="28"/>
+          <w:szCs w:val="28"/>
+        </w:rPr>
+        <w:t>m</w:t>
+      </w:r>
+      <w:r>
+        <w:rPr>
+          <w:rFonts w:ascii="Arial" w:hAnsi="Arial" w:cs="Arial"/>
+          <w:sz w:val="28"/>
+          <w:szCs w:val="28"/>
+        </w:rPr>
+        <w:t>ain.js then creates the core instances</w:t>
+      </w:r>
+      <w:r>
+        <w:rPr>
+          <w:rFonts w:ascii="Arial" w:hAnsi="Arial" w:cs="Arial"/>
+          <w:sz w:val="28"/>
+          <w:szCs w:val="28"/>
+        </w:rPr>
+        <w:t xml:space="preserve"> </w:t>
+      </w:r>
+      <w:r>
+        <w:rPr>
+          <w:rFonts w:ascii="Arial" w:hAnsi="Arial" w:cs="Arial"/>
+          <w:sz w:val="28"/>
+          <w:szCs w:val="28"/>
+        </w:rPr>
+        <w:t>player</w:t>
+      </w:r>
+      <w:r>
+        <w:rPr>
+          <w:rFonts w:ascii="Arial" w:hAnsi="Arial" w:cs="Arial"/>
+          <w:sz w:val="28"/>
+          <w:szCs w:val="28"/>
+        </w:rPr>
+        <w:t xml:space="preserve"> (</w:t>
+      </w:r>
+      <w:r>
+        <w:rPr>
+          <w:rFonts w:ascii="Arial" w:hAnsi="Arial" w:cs="Arial"/>
+          <w:sz w:val="28"/>
+          <w:szCs w:val="28"/>
+        </w:rPr>
+        <w:t>the brain that tracks everything about playback, broadcasting, syncing, and reconnecting</w:t>
+      </w:r>
+      <w:r>
+        <w:rPr>
+          <w:rFonts w:ascii="Arial" w:hAnsi="Arial" w:cs="Arial"/>
+          <w:sz w:val="28"/>
+          <w:szCs w:val="28"/>
+        </w:rPr>
+        <w:t xml:space="preserve"> from radio-player.js)</w:t>
+      </w:r>
+      <w:r>
+        <w:rPr>
+          <w:rFonts w:ascii="Arial" w:hAnsi="Arial" w:cs="Arial"/>
+          <w:sz w:val="28"/>
+          <w:szCs w:val="28"/>
+        </w:rPr>
+        <w:t xml:space="preserve"> and </w:t>
+      </w:r>
+      <w:r>
+        <w:rPr>
+          <w:rFonts w:ascii="Arial" w:hAnsi="Arial" w:cs="Arial"/>
+          <w:sz w:val="28"/>
+          <w:szCs w:val="28"/>
+        </w:rPr>
+        <w:t>playlistManager</w:t>
+      </w:r>
+      <w:r>
+        <w:rPr>
+          <w:rFonts w:ascii="Arial" w:hAnsi="Arial" w:cs="Arial"/>
+          <w:sz w:val="28"/>
+          <w:szCs w:val="28"/>
+        </w:rPr>
+        <w:t xml:space="preserve"> (</w:t>
+      </w:r>
+      <w:r>
+        <w:rPr>
+          <w:rFonts w:ascii="Arial" w:hAnsi="Arial" w:cs="Arial"/>
+          <w:sz w:val="28"/>
+          <w:szCs w:val="28"/>
+        </w:rPr>
+        <w:t>memory and organizer</w:t>
+      </w:r>
+      <w:r>
+        <w:rPr>
+          <w:rFonts w:ascii="Arial" w:hAnsi="Arial" w:cs="Arial"/>
+          <w:sz w:val="28"/>
+          <w:szCs w:val="28"/>
+        </w:rPr>
+        <w:t xml:space="preserve"> from playlist.js)</w:t>
+      </w:r>
+      <w:r>
+        <w:rPr>
+          <w:rFonts w:ascii="Arial" w:hAnsi="Arial" w:cs="Arial"/>
+          <w:sz w:val="28"/>
+          <w:szCs w:val="28"/>
+        </w:rPr>
+        <w:t>, about which we might speak later in more detail.</w:t>
+      </w:r>
+      <w:r>
+        <w:rPr>
+          <w:rFonts w:ascii="Arial" w:hAnsi="Arial" w:cs="Arial"/>
+          <w:sz w:val="28"/>
+          <w:szCs w:val="28"/>
+        </w:rPr>
+        <w:br/>
+      </w:r>
+      <w:r>
+        <w:rPr>
+          <w:rFonts w:ascii="Arial" w:hAnsi="Arial" w:cs="Arial"/>
+          <w:sz w:val="28"/>
+          <w:szCs w:val="28"/>
+        </w:rPr>
+        <w:br/>
+      </w:r>
+      <w:r>
+        <w:rPr>
+          <w:rFonts w:ascii="Arial" w:hAnsi="Arial" w:cs="Arial"/>
+          <w:sz w:val="28"/>
+          <w:szCs w:val="28"/>
+        </w:rPr>
+        <w:t>t</w:t>
+      </w:r>
+      <w:r>
+        <w:rPr>
+          <w:rFonts w:ascii="Arial" w:hAnsi="Arial" w:cs="Arial"/>
+          <w:sz w:val="28"/>
+          <w:szCs w:val="28"/>
+        </w:rPr>
+        <w:t xml:space="preserve">hese are attached to window so any other code (scripts, UI buttons) can access them globally. The player connects to the server over WebSocket to receive live updates, broadcast status, and listener info. </w:t>
+      </w:r>
+    </w:p>
+    <w:p>
+      <w:pPr>
+        <w:ind w:left="708"/>
+        <w:rPr>
+          <w:rFonts w:ascii="Arial" w:hAnsi="Arial" w:cs="Arial"/>
+          <w:sz w:val="28"/>
+          <w:szCs w:val="28"/>
+        </w:rPr>
+      </w:pPr>
+      <w:r>
+        <w:rPr>
+          <w:rFonts w:ascii="Arial" w:hAnsi="Arial" w:cs="Arial"/>
+          <w:sz w:val="28"/>
+          <w:szCs w:val="28"/>
+        </w:rPr>
+        <w:t>i</w:t>
+      </w:r>
+      <w:r>
+        <w:rPr>
+          <w:rFonts w:ascii="Arial" w:hAnsi="Arial" w:cs="Arial"/>
+          <w:sz w:val="28"/>
+          <w:szCs w:val="28"/>
+        </w:rPr>
+        <w:t>t runs an async session check on page load. If the server says the session expired (401), main.js forces a reload to get a fresh session.</w:t>
+      </w:r>
+    </w:p>
+    <w:p>
+      <w:pPr>
+        <w:ind w:left="708"/>
+        <w:rPr>
+          <w:rFonts w:ascii="Arial" w:hAnsi="Arial" w:cs="Arial"/>
+          <w:sz w:val="28"/>
+          <w:szCs w:val="28"/>
+        </w:rPr>
+      </w:pPr>
+    </w:p>
+    <w:p>
+      <w:pPr>
+        <w:ind w:left="708"/>
+        <w:rPr>
+          <w:rFonts w:ascii="Arial" w:hAnsi="Arial" w:cs="Arial"/>
+          <w:sz w:val="28"/>
+          <w:szCs w:val="28"/>
+        </w:rPr>
+      </w:pPr>
+      <w:r>
+        <w:rPr>
+          <w:rFonts w:ascii="Arial" w:hAnsi="Arial" w:cs="Arial"/>
+          <w:sz w:val="28"/>
+          <w:szCs w:val="28"/>
+        </w:rPr>
+        <w:t>b</w:t>
+      </w:r>
+      <w:r>
+        <w:rPr>
+          <w:rFonts w:ascii="Arial" w:hAnsi="Arial" w:cs="Arial"/>
+          <w:sz w:val="28"/>
+          <w:szCs w:val="28"/>
+        </w:rPr>
+        <w:t>utton event bindings come next:</w:t>
+      </w:r>
+    </w:p>
+    <w:p>
+      <w:pPr>
+        <w:numPr>
+          <w:ilvl w:val="0"/>
+          <w:numId w:val="5"/>
+        </w:numPr>
+        <w:rPr>
+          <w:rFonts w:ascii="Arial" w:hAnsi="Arial" w:cs="Arial"/>
+          <w:sz w:val="28"/>
+          <w:szCs w:val="28"/>
+        </w:rPr>
+      </w:pPr>
+      <w:r>
+        <w:rPr>
+          <w:rFonts w:ascii="Arial" w:hAnsi="Arial" w:cs="Arial"/>
+          <w:sz w:val="28"/>
+          <w:szCs w:val="28"/>
+        </w:rPr>
+        <w:t xml:space="preserve">tune-in reads the session ID input and tells the player to tune into that broadcaster. It updates UI badges, shows broadcaster info, and hides/shows relevant buttons. </w:t>
+      </w:r>
+    </w:p>
+    <w:p>
+      <w:pPr>
+        <w:numPr>
+          <w:ilvl w:val="0"/>
+          <w:numId w:val="5"/>
+        </w:numPr>
+        <w:rPr>
+          <w:rFonts w:ascii="Arial" w:hAnsi="Arial" w:cs="Arial"/>
+          <w:sz w:val="28"/>
+          <w:szCs w:val="28"/>
+        </w:rPr>
+      </w:pPr>
+      <w:r>
+        <w:rPr>
+          <w:rFonts w:ascii="Arial" w:hAnsi="Arial" w:cs="Arial"/>
+          <w:sz w:val="28"/>
+          <w:szCs w:val="28"/>
+        </w:rPr>
+        <w:t xml:space="preserve">tune-out switches back to private mode. </w:t>
+      </w:r>
+    </w:p>
+    <w:p>
+      <w:pPr>
+        <w:numPr>
+          <w:ilvl w:val="0"/>
+          <w:numId w:val="5"/>
+        </w:numPr>
+        <w:rPr>
+          <w:rFonts w:ascii="Arial" w:hAnsi="Arial" w:cs="Arial"/>
+          <w:sz w:val="28"/>
+          <w:szCs w:val="28"/>
+        </w:rPr>
+      </w:pPr>
+      <w:r>
+        <w:rPr>
+          <w:rFonts w:ascii="Arial" w:hAnsi="Arial" w:cs="Arial"/>
+          <w:sz w:val="28"/>
+          <w:szCs w:val="28"/>
+        </w:rPr>
+        <w:t xml:space="preserve">broadcast and stop-broadcast trigger broadcasting actions. </w:t>
+      </w:r>
+    </w:p>
+    <w:p>
+      <w:pPr>
+        <w:numPr>
+          <w:ilvl w:val="0"/>
+          <w:numId w:val="5"/>
+        </w:numPr>
+        <w:rPr>
+          <w:rFonts w:ascii="Arial" w:hAnsi="Arial" w:cs="Arial"/>
+          <w:sz w:val="28"/>
+          <w:szCs w:val="28"/>
+        </w:rPr>
+      </w:pPr>
+      <w:r>
+        <w:rPr>
+          <w:rFonts w:ascii="Arial" w:hAnsi="Arial" w:cs="Arial"/>
+          <w:sz w:val="28"/>
+          <w:szCs w:val="28"/>
+        </w:rPr>
+        <w:t>prev and next navigate the playlist if not in radio mode; in radio mode, they are disabled with an alert.</w:t>
+      </w:r>
+    </w:p>
+    <w:p>
+      <w:pPr>
+        <w:rPr>
+          <w:rFonts w:ascii="Arial" w:hAnsi="Arial" w:cs="Arial"/>
+          <w:sz w:val="28"/>
+          <w:szCs w:val="28"/>
+        </w:rPr>
+      </w:pPr>
+    </w:p>
+    <w:p>
+      <w:pPr>
+        <w:ind w:left="708"/>
+        <w:rPr>
+          <w:rFonts w:ascii="Arial" w:hAnsi="Arial" w:cs="Arial"/>
+          <w:sz w:val="28"/>
+          <w:szCs w:val="28"/>
+        </w:rPr>
+      </w:pPr>
+      <w:r>
+        <w:rPr>
+          <w:rFonts w:ascii="Arial" w:hAnsi="Arial" w:cs="Arial"/>
+          <w:sz w:val="28"/>
+          <w:szCs w:val="28"/>
+        </w:rPr>
+        <w:lastRenderedPageBreak/>
+        <w:t>p</w:t>
+      </w:r>
+      <w:r>
+        <w:rPr>
+          <w:rFonts w:ascii="Arial" w:hAnsi="Arial" w:cs="Arial"/>
+          <w:sz w:val="28"/>
+          <w:szCs w:val="28"/>
+        </w:rPr>
+        <w:t>age lifecycle events are wired: beforeunload and pagehide disconnect the player and stop broadcasting if the user navigates away, closes the tab</w:t>
+      </w:r>
+      <w:r>
+        <w:rPr>
+          <w:rFonts w:ascii="Arial" w:hAnsi="Arial" w:cs="Arial"/>
+          <w:sz w:val="28"/>
+          <w:szCs w:val="28"/>
+        </w:rPr>
+        <w:t xml:space="preserve"> or whatever elsa falls under those events</w:t>
+      </w:r>
+      <w:r>
+        <w:rPr>
+          <w:rFonts w:ascii="Arial" w:hAnsi="Arial" w:cs="Arial"/>
+          <w:sz w:val="28"/>
+          <w:szCs w:val="28"/>
+        </w:rPr>
+        <w:t>.</w:t>
+      </w:r>
+    </w:p>
+    <w:p>
+      <w:pPr>
+        <w:ind w:left="708"/>
+        <w:rPr>
+          <w:rFonts w:ascii="Arial" w:hAnsi="Arial" w:cs="Arial"/>
+          <w:sz w:val="28"/>
+          <w:szCs w:val="28"/>
+        </w:rPr>
+      </w:pPr>
+    </w:p>
+    <w:p>
+      <w:pPr>
+        <w:ind w:left="708"/>
+        <w:rPr>
+          <w:rFonts w:ascii="Arial" w:hAnsi="Arial" w:cs="Arial"/>
+          <w:sz w:val="28"/>
+          <w:szCs w:val="28"/>
+        </w:rPr>
+      </w:pPr>
+      <w:r>
+        <w:rPr>
+          <w:rFonts w:ascii="Arial" w:hAnsi="Arial" w:cs="Arial"/>
+          <w:sz w:val="28"/>
+          <w:szCs w:val="28"/>
+        </w:rPr>
+        <w:t>finally we call the playlistManager to loadPlaylist which goes to</w:t>
+      </w:r>
+    </w:p>
+    <w:p>
+      <w:pPr>
+        <w:ind w:left="1413"/>
+        <w:rPr>
+          <w:rFonts w:ascii="Arial" w:hAnsi="Arial" w:cs="Arial"/>
+          <w:sz w:val="28"/>
+          <w:szCs w:val="28"/>
+        </w:rPr>
+      </w:pPr>
+      <w:r>
+        <w:rPr>
+          <w:rFonts w:ascii="Arial" w:hAnsi="Arial" w:cs="Arial"/>
+          <w:sz w:val="28"/>
+          <w:szCs w:val="28"/>
+        </w:rPr>
+        <w:t xml:space="preserve">playlist.js, </w:t>
+      </w:r>
+      <w:r>
+        <w:rPr>
+          <w:rFonts w:ascii="Arial" w:hAnsi="Arial" w:cs="Arial"/>
+          <w:sz w:val="28"/>
+          <w:szCs w:val="28"/>
+        </w:rPr>
+        <w:t>loadPlaylist() kicks off by fetching the playlist and other files from the server in parallel using Promise.all(). Once both fetches resolve, it parses the JSON: the main media list goes into this.originalMedias and this.medias (a working copy), while other files</w:t>
+      </w:r>
+      <w:r>
+        <w:rPr>
+          <w:rFonts w:ascii="Arial" w:hAnsi="Arial" w:cs="Arial"/>
+          <w:sz w:val="28"/>
+          <w:szCs w:val="28"/>
+        </w:rPr>
+        <w:t xml:space="preserve"> (anything that isn’t playable type)</w:t>
+      </w:r>
+      <w:r>
+        <w:rPr>
+          <w:rFonts w:ascii="Arial" w:hAnsi="Arial" w:cs="Arial"/>
+          <w:sz w:val="28"/>
+          <w:szCs w:val="28"/>
+        </w:rPr>
+        <w:t xml:space="preserve"> go into this.otherFiles.</w:t>
+      </w:r>
+    </w:p>
+    <w:p>
+      <w:pPr>
+        <w:ind w:left="1413"/>
+        <w:rPr>
+          <w:rFonts w:ascii="Arial" w:hAnsi="Arial" w:cs="Arial"/>
+          <w:sz w:val="28"/>
+          <w:szCs w:val="28"/>
+        </w:rPr>
+      </w:pPr>
+      <w:r>
+        <w:rPr>
+          <w:rFonts w:ascii="Arial" w:hAnsi="Arial" w:cs="Arial"/>
+          <w:sz w:val="28"/>
+          <w:szCs w:val="28"/>
+        </w:rPr>
+        <w:t>we attempt to load a custom playlist order by calling in the same file:</w:t>
+      </w:r>
+    </w:p>
+    <w:p>
+      <w:pPr>
+        <w:ind w:left="2124" w:firstLine="9"/>
+        <w:rPr>
+          <w:rFonts w:ascii="Arial" w:hAnsi="Arial" w:cs="Arial"/>
+          <w:sz w:val="28"/>
+          <w:szCs w:val="28"/>
+        </w:rPr>
+      </w:pPr>
+      <w:r>
+        <w:rPr>
+          <w:rFonts w:ascii="Arial" w:hAnsi="Arial" w:cs="Arial"/>
+          <w:sz w:val="28"/>
+          <w:szCs w:val="28"/>
+        </w:rPr>
+        <w:t>loadCustomOrder() restores the playlist to a user’s saved order from localStorage. It first checks if there’s a saved order under this.storageKey, and if not, it just keeps the default playlist. If a saved order exists, it parses the JSON array of media IDs, filters out any invalid or missing IDs, and reorders this.medias to match the saved sequence, appending any media not in the saved order to the end. Throughout the process it logs whether the custom order was successfully loaded or if parsing failed. In short, it ensures the playlist appears exactly how the user left it last time.</w:t>
+      </w:r>
+    </w:p>
+    <w:p>
+      <w:pPr>
+        <w:rPr>
+          <w:rFonts w:ascii="Arial" w:hAnsi="Arial" w:cs="Arial"/>
+          <w:sz w:val="28"/>
+          <w:szCs w:val="28"/>
+        </w:rPr>
+      </w:pPr>
+      <w:r>
+        <w:rPr>
+          <w:rFonts w:ascii="Arial" w:hAnsi="Arial" w:cs="Arial"/>
+          <w:sz w:val="28"/>
+          <w:szCs w:val="28"/>
+        </w:rPr>
+        <w:tab/>
+      </w:r>
+      <w:r>
+        <w:rPr>
+          <w:rFonts w:ascii="Arial" w:hAnsi="Arial" w:cs="Arial"/>
+          <w:sz w:val="28"/>
+          <w:szCs w:val="28"/>
+        </w:rPr>
+        <w:tab/>
+      </w:r>
+    </w:p>
+    <w:p>
+      <w:pPr>
+        <w:rPr>
+          <w:rFonts w:ascii="Arial" w:hAnsi="Arial" w:cs="Arial"/>
+          <w:sz w:val="28"/>
+          <w:szCs w:val="28"/>
+        </w:rPr>
+      </w:pPr>
+      <w:r>
+        <w:rPr>
+          <w:rFonts w:ascii="Arial" w:hAnsi="Arial" w:cs="Arial"/>
+          <w:sz w:val="28"/>
+          <w:szCs w:val="28"/>
+        </w:rPr>
+        <w:tab/>
+      </w:r>
+      <w:r>
+        <w:rPr>
+          <w:rFonts w:ascii="Arial" w:hAnsi="Arial" w:cs="Arial"/>
+          <w:sz w:val="28"/>
+          <w:szCs w:val="28"/>
+        </w:rPr>
+        <w:tab/>
+        <w:t xml:space="preserve">then also from playlist.js we try to set the media ID to the one </w:t>
+      </w:r>
+      <w:r>
+        <w:rPr>
+          <w:rFonts w:ascii="Arial" w:hAnsi="Arial" w:cs="Arial"/>
+          <w:sz w:val="28"/>
+          <w:szCs w:val="28"/>
+        </w:rPr>
+        <w:tab/>
+      </w:r>
+      <w:r>
+        <w:rPr>
+          <w:rFonts w:ascii="Arial" w:hAnsi="Arial" w:cs="Arial"/>
+          <w:sz w:val="28"/>
+          <w:szCs w:val="28"/>
+        </w:rPr>
+        <w:tab/>
+        <w:t>determined server-side when the HTML itself got made:</w:t>
+      </w:r>
+    </w:p>
+    <w:p>
+      <w:pPr>
+        <w:ind w:left="2124" w:firstLine="6"/>
+        <w:rPr>
+          <w:rFonts w:ascii="Arial" w:hAnsi="Arial" w:cs="Arial"/>
+          <w:sz w:val="28"/>
+          <w:szCs w:val="28"/>
+        </w:rPr>
+      </w:pPr>
+      <w:r>
+        <w:rPr>
+          <w:rFonts w:ascii="Arial" w:hAnsi="Arial" w:cs="Arial"/>
+          <w:sz w:val="28"/>
+          <w:szCs w:val="28"/>
+        </w:rPr>
+        <w:t xml:space="preserve">syncCurrentFromAudio() ensures that the playlist manager knows which media is currently playing, even if the page was loaded with the &lt;audio&gt; or &lt;video&gt; element already set by the server. It first selects the active media element, falling back to the default audio player if none is set. It then reads the media source, checking both the element’s currentSrc or src and, if needed, the &lt;source&gt; child element’s src attribute, because the browser sometimes reports the document </w:t>
+      </w:r>
+      <w:r>
+        <w:rPr>
+          <w:rFonts w:ascii="Arial" w:hAnsi="Arial" w:cs="Arial"/>
+          <w:sz w:val="28"/>
+          <w:szCs w:val="28"/>
+        </w:rPr>
+        <w:lastRenderedPageBreak/>
+        <w:t>URL instead of the actual stream. It tries to extract either a media ID from a /stream/id/… path or an index from a /stream/… path, and sets this.currentMediaId accordingly. This keeps the playlist manager in sync with whatever is already playing and logs what it found</w:t>
+      </w:r>
+      <w:r>
+        <w:rPr>
+          <w:rFonts w:ascii="Arial" w:hAnsi="Arial" w:cs="Arial"/>
+          <w:sz w:val="28"/>
+          <w:szCs w:val="28"/>
+        </w:rPr>
+        <w:t>.</w:t>
+      </w:r>
+    </w:p>
+    <w:p>
+      <w:pPr>
+        <w:rPr>
+          <w:rFonts w:ascii="Arial" w:hAnsi="Arial" w:cs="Arial"/>
+          <w:sz w:val="28"/>
+          <w:szCs w:val="28"/>
+        </w:rPr>
+      </w:pPr>
+      <w:r>
+        <w:rPr>
+          <w:rFonts w:ascii="Arial" w:hAnsi="Arial" w:cs="Arial"/>
+          <w:sz w:val="28"/>
+          <w:szCs w:val="28"/>
+        </w:rPr>
+        <w:tab/>
+      </w:r>
+      <w:r>
+        <w:rPr>
+          <w:rFonts w:ascii="Arial" w:hAnsi="Arial" w:cs="Arial"/>
+          <w:sz w:val="28"/>
+          <w:szCs w:val="28"/>
+        </w:rPr>
+        <w:tab/>
+      </w:r>
+    </w:p>
+    <w:p>
+      <w:pPr>
+        <w:rPr>
+          <w:rFonts w:ascii="Arial" w:hAnsi="Arial" w:cs="Arial"/>
+          <w:sz w:val="28"/>
+          <w:szCs w:val="28"/>
+        </w:rPr>
+      </w:pPr>
+      <w:r>
+        <w:rPr>
+          <w:rFonts w:ascii="Arial" w:hAnsi="Arial" w:cs="Arial"/>
+          <w:sz w:val="28"/>
+          <w:szCs w:val="28"/>
+        </w:rPr>
+        <w:tab/>
+      </w:r>
+      <w:r>
+        <w:rPr>
+          <w:rFonts w:ascii="Arial" w:hAnsi="Arial" w:cs="Arial"/>
+          <w:sz w:val="28"/>
+          <w:szCs w:val="28"/>
+        </w:rPr>
+        <w:tab/>
+        <w:t>w</w:t>
+      </w:r>
+      <w:r>
+        <w:rPr>
+          <w:rFonts w:ascii="Arial" w:hAnsi="Arial" w:cs="Arial"/>
+          <w:sz w:val="28"/>
+          <w:szCs w:val="28"/>
+        </w:rPr>
+        <w:t xml:space="preserve">e countinue by making the operating system itself aware of </w:t>
+      </w:r>
+      <w:r>
+        <w:rPr>
+          <w:rFonts w:ascii="Arial" w:hAnsi="Arial" w:cs="Arial"/>
+          <w:sz w:val="28"/>
+          <w:szCs w:val="28"/>
+        </w:rPr>
+        <w:tab/>
+      </w:r>
+      <w:r>
+        <w:rPr>
+          <w:rFonts w:ascii="Arial" w:hAnsi="Arial" w:cs="Arial"/>
+          <w:sz w:val="28"/>
+          <w:szCs w:val="28"/>
+        </w:rPr>
+        <w:tab/>
+      </w:r>
+      <w:r>
+        <w:rPr>
+          <w:rFonts w:ascii="Arial" w:hAnsi="Arial" w:cs="Arial"/>
+          <w:sz w:val="28"/>
+          <w:szCs w:val="28"/>
+        </w:rPr>
+        <w:t xml:space="preserve">the track that’s currently playing, right when the page loads. </w:t>
+      </w:r>
+      <w:r>
+        <w:rPr>
+          <w:rFonts w:ascii="Arial" w:hAnsi="Arial" w:cs="Arial"/>
+          <w:sz w:val="28"/>
+          <w:szCs w:val="28"/>
+        </w:rPr>
+        <w:tab/>
+      </w:r>
+      <w:r>
+        <w:rPr>
+          <w:rFonts w:ascii="Arial" w:hAnsi="Arial" w:cs="Arial"/>
+          <w:sz w:val="28"/>
+          <w:szCs w:val="28"/>
+        </w:rPr>
+        <w:tab/>
+      </w:r>
+      <w:r>
+        <w:rPr>
+          <w:rFonts w:ascii="Arial" w:hAnsi="Arial" w:cs="Arial"/>
+          <w:sz w:val="28"/>
+          <w:szCs w:val="28"/>
+        </w:rPr>
+        <w:t xml:space="preserve">Even before the user interacts with anything, if </w:t>
+      </w:r>
+      <w:r>
+        <w:rPr>
+          <w:rFonts w:ascii="Arial" w:hAnsi="Arial" w:cs="Arial"/>
+          <w:sz w:val="28"/>
+          <w:szCs w:val="28"/>
+        </w:rPr>
+        <w:tab/>
+      </w:r>
+      <w:r>
+        <w:rPr>
+          <w:rFonts w:ascii="Arial" w:hAnsi="Arial" w:cs="Arial"/>
+          <w:sz w:val="28"/>
+          <w:szCs w:val="28"/>
+        </w:rPr>
+        <w:tab/>
+      </w:r>
+      <w:r>
+        <w:rPr>
+          <w:rFonts w:ascii="Arial" w:hAnsi="Arial" w:cs="Arial"/>
+          <w:sz w:val="28"/>
+          <w:szCs w:val="28"/>
+        </w:rPr>
+        <w:tab/>
+      </w:r>
+      <w:r>
+        <w:rPr>
+          <w:rFonts w:ascii="Arial" w:hAnsi="Arial" w:cs="Arial"/>
+          <w:sz w:val="28"/>
+          <w:szCs w:val="28"/>
+        </w:rPr>
+        <w:tab/>
+      </w:r>
+      <w:r>
+        <w:rPr>
+          <w:rFonts w:ascii="Arial" w:hAnsi="Arial" w:cs="Arial"/>
+          <w:sz w:val="28"/>
+          <w:szCs w:val="28"/>
+        </w:rPr>
+        <w:t xml:space="preserve">currentMediaId is already set (from syncing the </w:t>
+      </w:r>
+      <w:r>
+        <w:rPr>
+          <w:rFonts w:ascii="Arial" w:hAnsi="Arial" w:cs="Arial"/>
+          <w:sz w:val="28"/>
+          <w:szCs w:val="28"/>
+        </w:rPr>
+        <w:tab/>
+      </w:r>
+      <w:r>
+        <w:rPr>
+          <w:rFonts w:ascii="Arial" w:hAnsi="Arial" w:cs="Arial"/>
+          <w:sz w:val="28"/>
+          <w:szCs w:val="28"/>
+        </w:rPr>
+        <w:tab/>
+      </w:r>
+      <w:r>
+        <w:rPr>
+          <w:rFonts w:ascii="Arial" w:hAnsi="Arial" w:cs="Arial"/>
+          <w:sz w:val="28"/>
+          <w:szCs w:val="28"/>
+        </w:rPr>
+        <w:tab/>
+      </w:r>
+      <w:r>
+        <w:rPr>
+          <w:rFonts w:ascii="Arial" w:hAnsi="Arial" w:cs="Arial"/>
+          <w:sz w:val="28"/>
+          <w:szCs w:val="28"/>
+        </w:rPr>
+        <w:tab/>
+      </w:r>
+      <w:r>
+        <w:rPr>
+          <w:rFonts w:ascii="Arial" w:hAnsi="Arial" w:cs="Arial"/>
+          <w:sz w:val="28"/>
+          <w:szCs w:val="28"/>
+        </w:rPr>
+        <w:t xml:space="preserve">&lt;audio&gt;/&lt;video&gt; element), it looks up that media in the </w:t>
+      </w:r>
+      <w:r>
+        <w:rPr>
+          <w:rFonts w:ascii="Arial" w:hAnsi="Arial" w:cs="Arial"/>
+          <w:sz w:val="28"/>
+          <w:szCs w:val="28"/>
+        </w:rPr>
+        <w:tab/>
+      </w:r>
+      <w:r>
+        <w:rPr>
+          <w:rFonts w:ascii="Arial" w:hAnsi="Arial" w:cs="Arial"/>
+          <w:sz w:val="28"/>
+          <w:szCs w:val="28"/>
+        </w:rPr>
+        <w:tab/>
+      </w:r>
+      <w:r>
+        <w:rPr>
+          <w:rFonts w:ascii="Arial" w:hAnsi="Arial" w:cs="Arial"/>
+          <w:sz w:val="28"/>
+          <w:szCs w:val="28"/>
+        </w:rPr>
+        <w:tab/>
+      </w:r>
+      <w:r>
+        <w:rPr>
+          <w:rFonts w:ascii="Arial" w:hAnsi="Arial" w:cs="Arial"/>
+          <w:sz w:val="28"/>
+          <w:szCs w:val="28"/>
+        </w:rPr>
+        <w:t xml:space="preserve">playlist. If it finds it, it calls window.updateMediaSession with </w:t>
+      </w:r>
+      <w:r>
+        <w:rPr>
+          <w:rFonts w:ascii="Arial" w:hAnsi="Arial" w:cs="Arial"/>
+          <w:sz w:val="28"/>
+          <w:szCs w:val="28"/>
+        </w:rPr>
+        <w:tab/>
+      </w:r>
+      <w:r>
+        <w:rPr>
+          <w:rFonts w:ascii="Arial" w:hAnsi="Arial" w:cs="Arial"/>
+          <w:sz w:val="28"/>
+          <w:szCs w:val="28"/>
+        </w:rPr>
+        <w:tab/>
+      </w:r>
+      <w:r>
+        <w:rPr>
+          <w:rFonts w:ascii="Arial" w:hAnsi="Arial" w:cs="Arial"/>
+          <w:sz w:val="28"/>
+          <w:szCs w:val="28"/>
+        </w:rPr>
+        <w:t xml:space="preserve">the filename, which updates the OS-level media session—so </w:t>
+      </w:r>
+      <w:r>
+        <w:rPr>
+          <w:rFonts w:ascii="Arial" w:hAnsi="Arial" w:cs="Arial"/>
+          <w:sz w:val="28"/>
+          <w:szCs w:val="28"/>
+        </w:rPr>
+        <w:tab/>
+      </w:r>
+      <w:r>
+        <w:rPr>
+          <w:rFonts w:ascii="Arial" w:hAnsi="Arial" w:cs="Arial"/>
+          <w:sz w:val="28"/>
+          <w:szCs w:val="28"/>
+        </w:rPr>
+        <w:tab/>
+      </w:r>
+      <w:r>
+        <w:rPr>
+          <w:rFonts w:ascii="Arial" w:hAnsi="Arial" w:cs="Arial"/>
+          <w:sz w:val="28"/>
+          <w:szCs w:val="28"/>
+        </w:rPr>
+        <w:t xml:space="preserve">things like the lock screen, notification shade, or media keys </w:t>
+      </w:r>
+      <w:r>
+        <w:rPr>
+          <w:rFonts w:ascii="Arial" w:hAnsi="Arial" w:cs="Arial"/>
+          <w:sz w:val="28"/>
+          <w:szCs w:val="28"/>
+        </w:rPr>
+        <w:tab/>
+      </w:r>
+      <w:r>
+        <w:rPr>
+          <w:rFonts w:ascii="Arial" w:hAnsi="Arial" w:cs="Arial"/>
+          <w:sz w:val="28"/>
+          <w:szCs w:val="28"/>
+        </w:rPr>
+        <w:tab/>
+      </w:r>
+      <w:r>
+        <w:rPr>
+          <w:rFonts w:ascii="Arial" w:hAnsi="Arial" w:cs="Arial"/>
+          <w:sz w:val="28"/>
+          <w:szCs w:val="28"/>
+        </w:rPr>
+        <w:t>show the correct track and metadata.</w:t>
+      </w:r>
+    </w:p>
+    <w:p>
+      <w:pPr>
+        <w:ind w:left="708" w:firstLine="708"/>
+        <w:rPr>
+          <w:rFonts w:ascii="Arial" w:hAnsi="Arial" w:cs="Arial"/>
+          <w:sz w:val="28"/>
+          <w:szCs w:val="28"/>
+        </w:rPr>
+      </w:pPr>
+      <w:r>
+        <w:rPr>
+          <w:rFonts w:ascii="Arial" w:hAnsi="Arial" w:cs="Arial"/>
+          <w:sz w:val="28"/>
+          <w:szCs w:val="28"/>
+        </w:rPr>
+        <w:t>b</w:t>
+      </w:r>
+      <w:r>
+        <w:rPr>
+          <w:rFonts w:ascii="Arial" w:hAnsi="Arial" w:cs="Arial"/>
+          <w:sz w:val="28"/>
+          <w:szCs w:val="28"/>
+        </w:rPr>
+        <w:t xml:space="preserve">asically, it’s making sure the system “knows” what’s playing </w:t>
+      </w:r>
+      <w:r>
+        <w:rPr>
+          <w:rFonts w:ascii="Arial" w:hAnsi="Arial" w:cs="Arial"/>
+          <w:sz w:val="28"/>
+          <w:szCs w:val="28"/>
+        </w:rPr>
+        <w:tab/>
+      </w:r>
+      <w:r>
+        <w:rPr>
+          <w:rFonts w:ascii="Arial" w:hAnsi="Arial" w:cs="Arial"/>
+          <w:sz w:val="28"/>
+          <w:szCs w:val="28"/>
+        </w:rPr>
+        <w:t>even before JavaScript starts actively controlling playback.</w:t>
+      </w:r>
+    </w:p>
+    <w:p>
+      <w:pPr>
+        <w:ind w:left="708" w:firstLine="708"/>
+        <w:rPr>
+          <w:rFonts w:ascii="Arial" w:hAnsi="Arial" w:cs="Arial"/>
+          <w:sz w:val="28"/>
+          <w:szCs w:val="28"/>
+        </w:rPr>
+      </w:pPr>
+    </w:p>
+    <w:p>
+      <w:pPr>
+        <w:ind w:left="1416"/>
+        <w:rPr>
+          <w:rFonts w:ascii="Arial" w:hAnsi="Arial" w:cs="Arial"/>
+          <w:sz w:val="28"/>
+          <w:szCs w:val="28"/>
+        </w:rPr>
+      </w:pPr>
+      <w:r>
+        <w:rPr>
+          <w:rFonts w:ascii="Arial" w:hAnsi="Arial" w:cs="Arial"/>
+          <w:sz w:val="28"/>
+          <w:szCs w:val="28"/>
+        </w:rPr>
+        <w:t xml:space="preserve">finally we </w:t>
+      </w:r>
+      <w:r>
+        <w:rPr>
+          <w:rFonts w:ascii="Arial" w:hAnsi="Arial" w:cs="Arial"/>
+          <w:sz w:val="28"/>
+          <w:szCs w:val="28"/>
+        </w:rPr>
+        <w:t>update the visible playlist on the page. renderFilterBar() redraws the top navigation buttons so you can filter the playlist by all, audio, video, or other files, showing counts and highlighting the active filter. render() then populates the main playlist area with the actual items: media files get play buttons, download links, and badges for audio/video, while “other” files get download buttons and size/status info. Essentially, renderFilterBar() handles the filters at the top, and render() handles the full playlist display below it.</w:t>
+      </w:r>
+    </w:p>
+    <w:p>
+      <w:pPr>
+        <w:rPr>
+          <w:rFonts w:ascii="Arial" w:hAnsi="Arial" w:cs="Arial"/>
+          <w:sz w:val="28"/>
+          <w:szCs w:val="28"/>
+        </w:rPr>
+      </w:pPr>
+      <w:r>
+        <w:rPr>
+          <w:rFonts w:ascii="Arial" w:hAnsi="Arial" w:cs="Arial"/>
+          <w:sz w:val="28"/>
+          <w:szCs w:val="28"/>
+        </w:rPr>
+        <w:tab/>
+      </w:r>
+    </w:p>
+    <w:p>
+      <w:pPr>
+        <w:rPr>
+          <w:rFonts w:ascii="Arial" w:hAnsi="Arial" w:cs="Arial"/>
+          <w:sz w:val="28"/>
+          <w:szCs w:val="28"/>
+        </w:rPr>
+      </w:pPr>
+      <w:r>
+        <w:rPr>
+          <w:rFonts w:ascii="Arial" w:hAnsi="Arial" w:cs="Arial"/>
+          <w:sz w:val="28"/>
+          <w:szCs w:val="28"/>
+        </w:rPr>
+        <w:tab/>
+        <w:t>now we have a fully initilized HTML with all it’s gadgets</w:t>
+      </w:r>
+      <w:r>
+        <w:rPr>
+          <w:rFonts w:ascii="Arial" w:hAnsi="Arial" w:cs="Arial"/>
+          <w:sz w:val="28"/>
+          <w:szCs w:val="28"/>
+        </w:rPr>
+        <w:t>.</w:t>
+      </w:r>
+    </w:p>
+    <w:p>
+      <w:pPr>
+        <w:rPr>
+          <w:rFonts w:ascii="Arial" w:hAnsi="Arial" w:cs="Arial"/>
+          <w:sz w:val="28"/>
+          <w:szCs w:val="28"/>
+        </w:rPr>
+      </w:pPr>
+    </w:p>
+    <w:p>
+      <w:pPr>
+        <w:rPr>
+          <w:rFonts w:ascii="Arial" w:hAnsi="Arial" w:cs="Arial"/>
+          <w:sz w:val="28"/>
+          <w:szCs w:val="28"/>
+        </w:rPr>
+      </w:pPr>
+      <w:r>
+        <w:rPr>
+          <w:rFonts w:ascii="Arial" w:hAnsi="Arial" w:cs="Arial"/>
+          <w:sz w:val="28"/>
+          <w:szCs w:val="28"/>
+        </w:rPr>
+        <w:t>which means our stargzr instance is now fully up and running and ready for use. Let’s use it.</w:t>
+      </w:r>
+    </w:p>
+    <w:p>
+      <w:pPr>
+        <w:rPr>
+          <w:rFonts w:ascii="Arial" w:hAnsi="Arial" w:cs="Arial"/>
+          <w:sz w:val="28"/>
+          <w:szCs w:val="28"/>
+        </w:rPr>
+      </w:pPr>
+    </w:p>
+    <w:p>
+      <w:pPr>
+        <w:rPr>
+          <w:rFonts w:ascii="Arial" w:hAnsi="Arial" w:cs="Arial"/>
+          <w:sz w:val="28"/>
+          <w:szCs w:val="28"/>
+        </w:rPr>
+      </w:pPr>
+    </w:p>
+    <w:p>
+      <w:pPr>
+        <w:ind w:left="708"/>
+        <w:rPr>
+          <w:rFonts w:ascii="Arial" w:hAnsi="Arial" w:cs="Arial"/>
+          <w:sz w:val="28"/>
+          <w:szCs w:val="28"/>
+        </w:rPr>
+      </w:pPr>
+    </w:p>
+    <w:p>
+      <w:pPr>
+        <w:ind w:left="705"/>
+        <w:rPr>
+          <w:rFonts w:ascii="Arial" w:hAnsi="Arial" w:cs="Arial"/>
+          <w:sz w:val="28"/>
+          <w:szCs w:val="28"/>
+        </w:rPr>
+      </w:pPr>
+    </w:p>
+    <w:p>
+      <w:pPr>
+        <w:rPr>
+          <w:rFonts w:ascii="Arial" w:hAnsi="Arial" w:cs="Arial"/>
+          <w:sz w:val="28"/>
+          <w:szCs w:val="28"/>
+        </w:rPr>
+      </w:pPr>
+    </w:p>
+    <w:p>
+      <w:pPr>
+        <w:rPr>
+          <w:rFonts w:ascii="Arial" w:hAnsi="Arial" w:cs="Arial"/>
+          <w:sz w:val="28"/>
+          <w:szCs w:val="28"/>
+        </w:rPr>
+      </w:pPr>
+    </w:p>
+    <w:p>
+      <w:pPr>
+        <w:ind w:left="705"/>
+        <w:rPr>
+          <w:rFonts w:ascii="Arial" w:hAnsi="Arial" w:cs="Arial"/>
+          <w:sz w:val="28"/>
+          <w:szCs w:val="28"/>
+        </w:rPr>
+      </w:pPr>
     </w:p>
     <w:p>
       <w:pPr>
@@ -2112,9 +4458,9 @@
 <file path=word/numbering.xml><?xml version="1.0" encoding="utf-8"?>
 <w:numbering xmlns:wpc="http://schemas.microsoft.com/office/word/2010/wordprocessingCanvas" xmlns:cx="http://schemas.microsoft.com/office/drawing/2014/chartex" xmlns:cx1="http://schemas.microsoft.com/office/drawing/2015/9/8/chartex" xmlns:cx2="http://schemas.microsoft.com/office/drawing/2015/10/21/chartex" xmlns:cx3="http://schemas.microsoft.com/office/drawing/2016/5/9/chartex" xmlns:cx4="http://schemas.microsoft.com/office/drawing/2016/5/10/chartex" xmlns:cx5="http://schemas.microsoft.com/office/drawing/2016/5/11/chartex" xmlns:cx6="http://schemas.microsoft.com/office/drawing/2016/5/12/chartex" xmlns:cx7="http://schemas.microsoft.com/office/drawing/2016/5/13/chartex" xmlns:cx8="http://schemas.microsoft.com/office/drawing/2016/5/14/chartex" xmlns:mc="http://schemas.openxmlformats.org/markup-compatibility/2006" xmlns:aink="http://schemas.microsoft.com/office/drawing/2016/ink" xmlns:am3d="http://schemas.microsoft.com/office/drawing/2017/model3d" xmlns:o="urn:schemas-microsoft-com:office:office" xmlns:oel="http://schemas.microsoft.com/office/2019/extlst" xmlns:r="http://schemas.openxmlformats.org/officeDocument/2006/relationships" xmlns:m="http://schemas.openxmlformats.org/officeDocument/2006/math" xmlns:v="urn:schemas-microsoft-com:vml" xmlns:wp14="http://schemas.microsoft.com/office/word/2010/wordprocessingDrawing" xmlns:wp="http://schemas.openxmlformats.org/drawingml/2006/wordprocessingDrawing" xmlns:w10="urn:schemas-microsoft-com:office:word" xmlns:w="http://schemas.openxmlformats.org/wordprocessingml/2006/main" xmlns:w14="http://schemas.microsoft.com/office/word/2010/wordml" xmlns:w15="http://schemas.microsoft.com/office/word/2012/wordml" xmlns:w16cex="http://schemas.microsoft.com/office/word/2018/wordml/cex" xmlns:w16cid="http://schemas.microsoft.com/office/word/2016/wordml/cid" xmlns:w16="http://schemas.microsoft.com/office/word/2018/wordml" xmlns:w16du="http://schemas.microsoft.com/office/word/2023/wordml/word16du" xmlns:w16sdtdh="http://schemas.microsoft.com/office/word/2020/wordml/sdtdatahash" xmlns:w16sdtfl="http://schemas.microsoft.com/office/word/2024/wordml/sdtformatlock" xmlns:w16se="http://schemas.microsoft.com/office/word/2015/wordml/symex" xmlns:wpg="http://schemas.microsoft.com/office/word/2010/wordprocessingGroup" xmlns:wpi="http://schemas.microsoft.com/office/word/2010/wordprocessingInk" xmlns:wne="http://schemas.microsoft.com/office/word/2006/wordml" xmlns:wps="http://schemas.microsoft.com/office/word/2010/wordprocessingShape" mc:Ignorable="w14 w15 w16se w16cid w16 w16cex w16sdtdh w16sdtfl w16du wp14">
   <w:abstractNum w:abstractNumId="0" w15:restartNumberingAfterBreak="0">
-    <w:nsid w:val="227A5B5C"/>
+    <w:nsid w:val="13490676"/>
     <w:multiLevelType w:val="multilevel"/>
-    <w:tmpl w:val="43E88F2E"/>
+    <w:tmpl w:val="1570E2D2"/>
     <w:lvl w:ilvl="0">
       <w:start w:val="1"/>
       <w:numFmt w:val="bullet"/>
@@ -2122,9 +4468,9 @@
       <w:lvlJc w:val="left"/>
       <w:pPr>
         <w:tabs>
-          <w:tab w:val="num" w:pos="720"/>
+          <w:tab w:val="num" w:pos="1428"/>
         </w:tabs>
-        <w:ind w:left="720" w:hanging="360"/>
+        <w:ind w:left="1428" w:hanging="360"/>
       </w:pPr>
       <w:rPr>
         <w:rFonts w:ascii="Symbol" w:hAnsi="Symbol" w:hint="default"/>
@@ -2138,9 +4484,9 @@
       <w:lvlJc w:val="left"/>
       <w:pPr>
         <w:tabs>
-          <w:tab w:val="num" w:pos="1440"/>
+          <w:tab w:val="num" w:pos="2148"/>
         </w:tabs>
-        <w:ind w:left="1440" w:hanging="360"/>
+        <w:ind w:left="2148" w:hanging="360"/>
       </w:pPr>
       <w:rPr>
         <w:rFonts w:ascii="Courier New" w:hAnsi="Courier New" w:hint="default"/>
@@ -2154,9 +4500,9 @@
       <w:lvlJc w:val="left"/>
       <w:pPr>
         <w:tabs>
-          <w:tab w:val="num" w:pos="2160"/>
+          <w:tab w:val="num" w:pos="2868"/>
         </w:tabs>
-        <w:ind w:left="2160" w:hanging="360"/>
+        <w:ind w:left="2868" w:hanging="360"/>
       </w:pPr>
       <w:rPr>
         <w:rFonts w:ascii="Wingdings" w:hAnsi="Wingdings" w:hint="default"/>
@@ -2170,9 +4516,9 @@
       <w:lvlJc w:val="left"/>
       <w:pPr>
         <w:tabs>
-          <w:tab w:val="num" w:pos="2880"/>
+          <w:tab w:val="num" w:pos="3588"/>
         </w:tabs>
-        <w:ind w:left="2880" w:hanging="360"/>
+        <w:ind w:left="3588" w:hanging="360"/>
       </w:pPr>
       <w:rPr>
         <w:rFonts w:ascii="Wingdings" w:hAnsi="Wingdings" w:hint="default"/>
@@ -2186,9 +4532,9 @@
       <w:lvlJc w:val="left"/>
       <w:pPr>
         <w:tabs>
-          <w:tab w:val="num" w:pos="3600"/>
+          <w:tab w:val="num" w:pos="4308"/>
         </w:tabs>
-        <w:ind w:left="3600" w:hanging="360"/>
+        <w:ind w:left="4308" w:hanging="360"/>
       </w:pPr>
       <w:rPr>
         <w:rFonts w:ascii="Wingdings" w:hAnsi="Wingdings" w:hint="default"/>
@@ -2202,9 +4548,9 @@
       <w:lvlJc w:val="left"/>
       <w:pPr>
         <w:tabs>
-          <w:tab w:val="num" w:pos="4320"/>
+          <w:tab w:val="num" w:pos="5028"/>
         </w:tabs>
-        <w:ind w:left="4320" w:hanging="360"/>
+        <w:ind w:left="5028" w:hanging="360"/>
       </w:pPr>
       <w:rPr>
         <w:rFonts w:ascii="Wingdings" w:hAnsi="Wingdings" w:hint="default"/>
@@ -2218,9 +4564,9 @@
       <w:lvlJc w:val="left"/>
       <w:pPr>
         <w:tabs>
-          <w:tab w:val="num" w:pos="5040"/>
+          <w:tab w:val="num" w:pos="5748"/>
         </w:tabs>
-        <w:ind w:left="5040" w:hanging="360"/>
+        <w:ind w:left="5748" w:hanging="360"/>
       </w:pPr>
       <w:rPr>
         <w:rFonts w:ascii="Wingdings" w:hAnsi="Wingdings" w:hint="default"/>
@@ -2234,9 +4580,9 @@
       <w:lvlJc w:val="left"/>
       <w:pPr>
         <w:tabs>
-          <w:tab w:val="num" w:pos="5760"/>
+          <w:tab w:val="num" w:pos="6468"/>
         </w:tabs>
-        <w:ind w:left="5760" w:hanging="360"/>
+        <w:ind w:left="6468" w:hanging="360"/>
       </w:pPr>
       <w:rPr>
         <w:rFonts w:ascii="Wingdings" w:hAnsi="Wingdings" w:hint="default"/>
@@ -2250,9 +4596,9 @@
       <w:lvlJc w:val="left"/>
       <w:pPr>
         <w:tabs>
-          <w:tab w:val="num" w:pos="6480"/>
+          <w:tab w:val="num" w:pos="7188"/>
         </w:tabs>
-        <w:ind w:left="6480" w:hanging="360"/>
+        <w:ind w:left="7188" w:hanging="360"/>
       </w:pPr>
       <w:rPr>
         <w:rFonts w:ascii="Wingdings" w:hAnsi="Wingdings" w:hint="default"/>
@@ -2261,9 +4607,9 @@
     </w:lvl>
   </w:abstractNum>
   <w:abstractNum w:abstractNumId="1" w15:restartNumberingAfterBreak="0">
-    <w:nsid w:val="2C56126A"/>
+    <w:nsid w:val="227A5B5C"/>
     <w:multiLevelType w:val="multilevel"/>
-    <w:tmpl w:val="3B6E61E0"/>
+    <w:tmpl w:val="43E88F2E"/>
     <w:lvl w:ilvl="0">
       <w:start w:val="1"/>
       <w:numFmt w:val="bullet"/>
@@ -2409,11 +4755,467 @@
       </w:rPr>
     </w:lvl>
   </w:abstractNum>
+  <w:abstractNum w:abstractNumId="2" w15:restartNumberingAfterBreak="0">
+    <w:nsid w:val="2C56126A"/>
+    <w:multiLevelType w:val="multilevel"/>
+    <w:tmpl w:val="3B6E61E0"/>
+    <w:lvl w:ilvl="0">
+      <w:start w:val="1"/>
+      <w:numFmt w:val="bullet"/>
+      <w:lvlText w:val=""/>
+      <w:lvlJc w:val="left"/>
+      <w:pPr>
+        <w:tabs>
+          <w:tab w:val="num" w:pos="720"/>
+        </w:tabs>
+        <w:ind w:left="720" w:hanging="360"/>
+      </w:pPr>
+      <w:rPr>
+        <w:rFonts w:ascii="Symbol" w:hAnsi="Symbol" w:hint="default"/>
+        <w:sz w:val="20"/>
+      </w:rPr>
+    </w:lvl>
+    <w:lvl w:ilvl="1" w:tentative="1">
+      <w:start w:val="1"/>
+      <w:numFmt w:val="bullet"/>
+      <w:lvlText w:val="o"/>
+      <w:lvlJc w:val="left"/>
+      <w:pPr>
+        <w:tabs>
+          <w:tab w:val="num" w:pos="1440"/>
+        </w:tabs>
+        <w:ind w:left="1440" w:hanging="360"/>
+      </w:pPr>
+      <w:rPr>
+        <w:rFonts w:ascii="Courier New" w:hAnsi="Courier New" w:hint="default"/>
+        <w:sz w:val="20"/>
+      </w:rPr>
+    </w:lvl>
+    <w:lvl w:ilvl="2" w:tentative="1">
+      <w:start w:val="1"/>
+      <w:numFmt w:val="bullet"/>
+      <w:lvlText w:val=""/>
+      <w:lvlJc w:val="left"/>
+      <w:pPr>
+        <w:tabs>
+          <w:tab w:val="num" w:pos="2160"/>
+        </w:tabs>
+        <w:ind w:left="2160" w:hanging="360"/>
+      </w:pPr>
+      <w:rPr>
+        <w:rFonts w:ascii="Wingdings" w:hAnsi="Wingdings" w:hint="default"/>
+        <w:sz w:val="20"/>
+      </w:rPr>
+    </w:lvl>
+    <w:lvl w:ilvl="3" w:tentative="1">
+      <w:start w:val="1"/>
+      <w:numFmt w:val="bullet"/>
+      <w:lvlText w:val=""/>
+      <w:lvlJc w:val="left"/>
+      <w:pPr>
+        <w:tabs>
+          <w:tab w:val="num" w:pos="2880"/>
+        </w:tabs>
+        <w:ind w:left="2880" w:hanging="360"/>
+      </w:pPr>
+      <w:rPr>
+        <w:rFonts w:ascii="Wingdings" w:hAnsi="Wingdings" w:hint="default"/>
+        <w:sz w:val="20"/>
+      </w:rPr>
+    </w:lvl>
+    <w:lvl w:ilvl="4" w:tentative="1">
+      <w:start w:val="1"/>
+      <w:numFmt w:val="bullet"/>
+      <w:lvlText w:val=""/>
+      <w:lvlJc w:val="left"/>
+      <w:pPr>
+        <w:tabs>
+          <w:tab w:val="num" w:pos="3600"/>
+        </w:tabs>
+        <w:ind w:left="3600" w:hanging="360"/>
+      </w:pPr>
+      <w:rPr>
+        <w:rFonts w:ascii="Wingdings" w:hAnsi="Wingdings" w:hint="default"/>
+        <w:sz w:val="20"/>
+      </w:rPr>
+    </w:lvl>
+    <w:lvl w:ilvl="5" w:tentative="1">
+      <w:start w:val="1"/>
+      <w:numFmt w:val="bullet"/>
+      <w:lvlText w:val=""/>
+      <w:lvlJc w:val="left"/>
+      <w:pPr>
+        <w:tabs>
+          <w:tab w:val="num" w:pos="4320"/>
+        </w:tabs>
+        <w:ind w:left="4320" w:hanging="360"/>
+      </w:pPr>
+      <w:rPr>
+        <w:rFonts w:ascii="Wingdings" w:hAnsi="Wingdings" w:hint="default"/>
+        <w:sz w:val="20"/>
+      </w:rPr>
+    </w:lvl>
+    <w:lvl w:ilvl="6" w:tentative="1">
+      <w:start w:val="1"/>
+      <w:numFmt w:val="bullet"/>
+      <w:lvlText w:val=""/>
+      <w:lvlJc w:val="left"/>
+      <w:pPr>
+        <w:tabs>
+          <w:tab w:val="num" w:pos="5040"/>
+        </w:tabs>
+        <w:ind w:left="5040" w:hanging="360"/>
+      </w:pPr>
+      <w:rPr>
+        <w:rFonts w:ascii="Wingdings" w:hAnsi="Wingdings" w:hint="default"/>
+        <w:sz w:val="20"/>
+      </w:rPr>
+    </w:lvl>
+    <w:lvl w:ilvl="7" w:tentative="1">
+      <w:start w:val="1"/>
+      <w:numFmt w:val="bullet"/>
+      <w:lvlText w:val=""/>
+      <w:lvlJc w:val="left"/>
+      <w:pPr>
+        <w:tabs>
+          <w:tab w:val="num" w:pos="5760"/>
+        </w:tabs>
+        <w:ind w:left="5760" w:hanging="360"/>
+      </w:pPr>
+      <w:rPr>
+        <w:rFonts w:ascii="Wingdings" w:hAnsi="Wingdings" w:hint="default"/>
+        <w:sz w:val="20"/>
+      </w:rPr>
+    </w:lvl>
+    <w:lvl w:ilvl="8" w:tentative="1">
+      <w:start w:val="1"/>
+      <w:numFmt w:val="bullet"/>
+      <w:lvlText w:val=""/>
+      <w:lvlJc w:val="left"/>
+      <w:pPr>
+        <w:tabs>
+          <w:tab w:val="num" w:pos="6480"/>
+        </w:tabs>
+        <w:ind w:left="6480" w:hanging="360"/>
+      </w:pPr>
+      <w:rPr>
+        <w:rFonts w:ascii="Wingdings" w:hAnsi="Wingdings" w:hint="default"/>
+        <w:sz w:val="20"/>
+      </w:rPr>
+    </w:lvl>
+  </w:abstractNum>
+  <w:abstractNum w:abstractNumId="3" w15:restartNumberingAfterBreak="0">
+    <w:nsid w:val="32953191"/>
+    <w:multiLevelType w:val="multilevel"/>
+    <w:tmpl w:val="951E13E8"/>
+    <w:lvl w:ilvl="0">
+      <w:start w:val="1"/>
+      <w:numFmt w:val="bullet"/>
+      <w:lvlText w:val=""/>
+      <w:lvlJc w:val="left"/>
+      <w:pPr>
+        <w:tabs>
+          <w:tab w:val="num" w:pos="1428"/>
+        </w:tabs>
+        <w:ind w:left="1428" w:hanging="360"/>
+      </w:pPr>
+      <w:rPr>
+        <w:rFonts w:ascii="Symbol" w:hAnsi="Symbol" w:hint="default"/>
+        <w:sz w:val="20"/>
+      </w:rPr>
+    </w:lvl>
+    <w:lvl w:ilvl="1">
+      <w:start w:val="1"/>
+      <w:numFmt w:val="bullet"/>
+      <w:lvlText w:val="o"/>
+      <w:lvlJc w:val="left"/>
+      <w:pPr>
+        <w:tabs>
+          <w:tab w:val="num" w:pos="2148"/>
+        </w:tabs>
+        <w:ind w:left="2148" w:hanging="360"/>
+      </w:pPr>
+      <w:rPr>
+        <w:rFonts w:ascii="Courier New" w:hAnsi="Courier New" w:hint="default"/>
+        <w:sz w:val="20"/>
+      </w:rPr>
+    </w:lvl>
+    <w:lvl w:ilvl="2" w:tentative="1">
+      <w:start w:val="1"/>
+      <w:numFmt w:val="bullet"/>
+      <w:lvlText w:val=""/>
+      <w:lvlJc w:val="left"/>
+      <w:pPr>
+        <w:tabs>
+          <w:tab w:val="num" w:pos="2868"/>
+        </w:tabs>
+        <w:ind w:left="2868" w:hanging="360"/>
+      </w:pPr>
+      <w:rPr>
+        <w:rFonts w:ascii="Wingdings" w:hAnsi="Wingdings" w:hint="default"/>
+        <w:sz w:val="20"/>
+      </w:rPr>
+    </w:lvl>
+    <w:lvl w:ilvl="3" w:tentative="1">
+      <w:start w:val="1"/>
+      <w:numFmt w:val="bullet"/>
+      <w:lvlText w:val=""/>
+      <w:lvlJc w:val="left"/>
+      <w:pPr>
+        <w:tabs>
+          <w:tab w:val="num" w:pos="3588"/>
+        </w:tabs>
+        <w:ind w:left="3588" w:hanging="360"/>
+      </w:pPr>
+      <w:rPr>
+        <w:rFonts w:ascii="Wingdings" w:hAnsi="Wingdings" w:hint="default"/>
+        <w:sz w:val="20"/>
+      </w:rPr>
+    </w:lvl>
+    <w:lvl w:ilvl="4" w:tentative="1">
+      <w:start w:val="1"/>
+      <w:numFmt w:val="bullet"/>
+      <w:lvlText w:val=""/>
+      <w:lvlJc w:val="left"/>
+      <w:pPr>
+        <w:tabs>
+          <w:tab w:val="num" w:pos="4308"/>
+        </w:tabs>
+        <w:ind w:left="4308" w:hanging="360"/>
+      </w:pPr>
+      <w:rPr>
+        <w:rFonts w:ascii="Wingdings" w:hAnsi="Wingdings" w:hint="default"/>
+        <w:sz w:val="20"/>
+      </w:rPr>
+    </w:lvl>
+    <w:lvl w:ilvl="5" w:tentative="1">
+      <w:start w:val="1"/>
+      <w:numFmt w:val="bullet"/>
+      <w:lvlText w:val=""/>
+      <w:lvlJc w:val="left"/>
+      <w:pPr>
+        <w:tabs>
+          <w:tab w:val="num" w:pos="5028"/>
+        </w:tabs>
+        <w:ind w:left="5028" w:hanging="360"/>
+      </w:pPr>
+      <w:rPr>
+        <w:rFonts w:ascii="Wingdings" w:hAnsi="Wingdings" w:hint="default"/>
+        <w:sz w:val="20"/>
+      </w:rPr>
+    </w:lvl>
+    <w:lvl w:ilvl="6" w:tentative="1">
+      <w:start w:val="1"/>
+      <w:numFmt w:val="bullet"/>
+      <w:lvlText w:val=""/>
+      <w:lvlJc w:val="left"/>
+      <w:pPr>
+        <w:tabs>
+          <w:tab w:val="num" w:pos="5748"/>
+        </w:tabs>
+        <w:ind w:left="5748" w:hanging="360"/>
+      </w:pPr>
+      <w:rPr>
+        <w:rFonts w:ascii="Wingdings" w:hAnsi="Wingdings" w:hint="default"/>
+        <w:sz w:val="20"/>
+      </w:rPr>
+    </w:lvl>
+    <w:lvl w:ilvl="7" w:tentative="1">
+      <w:start w:val="1"/>
+      <w:numFmt w:val="bullet"/>
+      <w:lvlText w:val=""/>
+      <w:lvlJc w:val="left"/>
+      <w:pPr>
+        <w:tabs>
+          <w:tab w:val="num" w:pos="6468"/>
+        </w:tabs>
+        <w:ind w:left="6468" w:hanging="360"/>
+      </w:pPr>
+      <w:rPr>
+        <w:rFonts w:ascii="Wingdings" w:hAnsi="Wingdings" w:hint="default"/>
+        <w:sz w:val="20"/>
+      </w:rPr>
+    </w:lvl>
+    <w:lvl w:ilvl="8" w:tentative="1">
+      <w:start w:val="1"/>
+      <w:numFmt w:val="bullet"/>
+      <w:lvlText w:val=""/>
+      <w:lvlJc w:val="left"/>
+      <w:pPr>
+        <w:tabs>
+          <w:tab w:val="num" w:pos="7188"/>
+        </w:tabs>
+        <w:ind w:left="7188" w:hanging="360"/>
+      </w:pPr>
+      <w:rPr>
+        <w:rFonts w:ascii="Wingdings" w:hAnsi="Wingdings" w:hint="default"/>
+        <w:sz w:val="20"/>
+      </w:rPr>
+    </w:lvl>
+  </w:abstractNum>
+  <w:abstractNum w:abstractNumId="4" w15:restartNumberingAfterBreak="0">
+    <w:nsid w:val="61DD350C"/>
+    <w:multiLevelType w:val="multilevel"/>
+    <w:tmpl w:val="BD12E21A"/>
+    <w:lvl w:ilvl="0">
+      <w:start w:val="1"/>
+      <w:numFmt w:val="bullet"/>
+      <w:lvlText w:val=""/>
+      <w:lvlJc w:val="left"/>
+      <w:pPr>
+        <w:tabs>
+          <w:tab w:val="num" w:pos="1428"/>
+        </w:tabs>
+        <w:ind w:left="1428" w:hanging="360"/>
+      </w:pPr>
+      <w:rPr>
+        <w:rFonts w:ascii="Symbol" w:hAnsi="Symbol" w:hint="default"/>
+        <w:sz w:val="20"/>
+      </w:rPr>
+    </w:lvl>
+    <w:lvl w:ilvl="1" w:tentative="1">
+      <w:start w:val="1"/>
+      <w:numFmt w:val="bullet"/>
+      <w:lvlText w:val="o"/>
+      <w:lvlJc w:val="left"/>
+      <w:pPr>
+        <w:tabs>
+          <w:tab w:val="num" w:pos="2148"/>
+        </w:tabs>
+        <w:ind w:left="2148" w:hanging="360"/>
+      </w:pPr>
+      <w:rPr>
+        <w:rFonts w:ascii="Courier New" w:hAnsi="Courier New" w:hint="default"/>
+        <w:sz w:val="20"/>
+      </w:rPr>
+    </w:lvl>
+    <w:lvl w:ilvl="2" w:tentative="1">
+      <w:start w:val="1"/>
+      <w:numFmt w:val="bullet"/>
+      <w:lvlText w:val=""/>
+      <w:lvlJc w:val="left"/>
+      <w:pPr>
+        <w:tabs>
+          <w:tab w:val="num" w:pos="2868"/>
+        </w:tabs>
+        <w:ind w:left="2868" w:hanging="360"/>
+      </w:pPr>
+      <w:rPr>
+        <w:rFonts w:ascii="Wingdings" w:hAnsi="Wingdings" w:hint="default"/>
+        <w:sz w:val="20"/>
+      </w:rPr>
+    </w:lvl>
+    <w:lvl w:ilvl="3" w:tentative="1">
+      <w:start w:val="1"/>
+      <w:numFmt w:val="bullet"/>
+      <w:lvlText w:val=""/>
+      <w:lvlJc w:val="left"/>
+      <w:pPr>
+        <w:tabs>
+          <w:tab w:val="num" w:pos="3588"/>
+        </w:tabs>
+        <w:ind w:left="3588" w:hanging="360"/>
+      </w:pPr>
+      <w:rPr>
+        <w:rFonts w:ascii="Wingdings" w:hAnsi="Wingdings" w:hint="default"/>
+        <w:sz w:val="20"/>
+      </w:rPr>
+    </w:lvl>
+    <w:lvl w:ilvl="4" w:tentative="1">
+      <w:start w:val="1"/>
+      <w:numFmt w:val="bullet"/>
+      <w:lvlText w:val=""/>
+      <w:lvlJc w:val="left"/>
+      <w:pPr>
+        <w:tabs>
+          <w:tab w:val="num" w:pos="4308"/>
+        </w:tabs>
+        <w:ind w:left="4308" w:hanging="360"/>
+      </w:pPr>
+      <w:rPr>
+        <w:rFonts w:ascii="Wingdings" w:hAnsi="Wingdings" w:hint="default"/>
+        <w:sz w:val="20"/>
+      </w:rPr>
+    </w:lvl>
+    <w:lvl w:ilvl="5" w:tentative="1">
+      <w:start w:val="1"/>
+      <w:numFmt w:val="bullet"/>
+      <w:lvlText w:val=""/>
+      <w:lvlJc w:val="left"/>
+      <w:pPr>
+        <w:tabs>
+          <w:tab w:val="num" w:pos="5028"/>
+        </w:tabs>
+        <w:ind w:left="5028" w:hanging="360"/>
+      </w:pPr>
+      <w:rPr>
+        <w:rFonts w:ascii="Wingdings" w:hAnsi="Wingdings" w:hint="default"/>
+        <w:sz w:val="20"/>
+      </w:rPr>
+    </w:lvl>
+    <w:lvl w:ilvl="6" w:tentative="1">
+      <w:start w:val="1"/>
+      <w:numFmt w:val="bullet"/>
+      <w:lvlText w:val=""/>
+      <w:lvlJc w:val="left"/>
+      <w:pPr>
+        <w:tabs>
+          <w:tab w:val="num" w:pos="5748"/>
+        </w:tabs>
+        <w:ind w:left="5748" w:hanging="360"/>
+      </w:pPr>
+      <w:rPr>
+        <w:rFonts w:ascii="Wingdings" w:hAnsi="Wingdings" w:hint="default"/>
+        <w:sz w:val="20"/>
+      </w:rPr>
+    </w:lvl>
+    <w:lvl w:ilvl="7" w:tentative="1">
+      <w:start w:val="1"/>
+      <w:numFmt w:val="bullet"/>
+      <w:lvlText w:val=""/>
+      <w:lvlJc w:val="left"/>
+      <w:pPr>
+        <w:tabs>
+          <w:tab w:val="num" w:pos="6468"/>
+        </w:tabs>
+        <w:ind w:left="6468" w:hanging="360"/>
+      </w:pPr>
+      <w:rPr>
+        <w:rFonts w:ascii="Wingdings" w:hAnsi="Wingdings" w:hint="default"/>
+        <w:sz w:val="20"/>
+      </w:rPr>
+    </w:lvl>
+    <w:lvl w:ilvl="8" w:tentative="1">
+      <w:start w:val="1"/>
+      <w:numFmt w:val="bullet"/>
+      <w:lvlText w:val=""/>
+      <w:lvlJc w:val="left"/>
+      <w:pPr>
+        <w:tabs>
+          <w:tab w:val="num" w:pos="7188"/>
+        </w:tabs>
+        <w:ind w:left="7188" w:hanging="360"/>
+      </w:pPr>
+      <w:rPr>
+        <w:rFonts w:ascii="Wingdings" w:hAnsi="Wingdings" w:hint="default"/>
+        <w:sz w:val="20"/>
+      </w:rPr>
+    </w:lvl>
+  </w:abstractNum>
   <w:num w:numId="1" w16cid:durableId="746149806">
-    <w:abstractNumId w:val="0"/>
+    <w:abstractNumId w:val="1"/>
   </w:num>
   <w:num w:numId="2" w16cid:durableId="799762808">
-    <w:abstractNumId w:val="1"/>
+    <w:abstractNumId w:val="2"/>
+  </w:num>
+  <w:num w:numId="3" w16cid:durableId="223223255">
+    <w:abstractNumId w:val="3"/>
+  </w:num>
+  <w:num w:numId="4" w16cid:durableId="1116362803">
+    <w:abstractNumId w:val="4"/>
+  </w:num>
+  <w:num w:numId="5" w16cid:durableId="105930635">
+    <w:abstractNumId w:val="0"/>
   </w:num>
 </w:numbering>
 </file>

</xml_diff>